<commit_message>
day 31: tao giao dien cap nhat phi dich vu cua quan li + dang ki xe ben giao dien cu dan
</commit_message>
<xml_diff>
--- a/assets/templates/hd_dichvu.docx
+++ b/assets/templates/hd_dichvu.docx
@@ -12792,7 +12792,7 @@
               <w:sz w:val="28"/>
               <w:szCs w:val="28"/>
             </w:rPr>
-            <w:alias w:val="motobike_roofed_fee"/>
+            <w:alias w:val="motorbike_roofed_fee"/>
             <w:tag w:val="text"/>
             <w:id w:val="1113098889"/>
             <w:placeholder>
@@ -17885,8 +17885,10 @@
   <w:rsids>
     <w:rsidRoot w:val="00217F6A"/>
     <w:rsid w:val="000877A5"/>
+    <w:rsid w:val="00144AED"/>
     <w:rsid w:val="001D169B"/>
     <w:rsid w:val="00217F6A"/>
+    <w:rsid w:val="00390AE5"/>
     <w:rsid w:val="004B0F81"/>
     <w:rsid w:val="004B2F72"/>
     <w:rsid w:val="005C3E9A"/>

</xml_diff>

<commit_message>
Day 33: them phan xem hop dong cho cu dan + sua fix nhieu loi linh tinh
</commit_message>
<xml_diff>
--- a/assets/templates/hd_dichvu.docx
+++ b/assets/templates/hd_dichvu.docx
@@ -662,6 +662,325 @@
     </w:p>
     <w:p>
       <w:pPr>
+        <w:spacing w:line="360" w:lineRule="auto"/>
+        <w:contextualSpacing/>
+        <w:jc w:val="both"/>
+        <w:rPr>
+          <w:color w:val="000000" w:themeColor="text1"/>
+          <w:sz w:val="28"/>
+          <w:szCs w:val="28"/>
+        </w:rPr>
+      </w:pPr>
+    </w:p>
+    <w:p>
+      <w:pPr>
+        <w:spacing w:line="360" w:lineRule="auto"/>
+        <w:contextualSpacing/>
+        <w:jc w:val="both"/>
+        <w:rPr>
+          <w:color w:val="000000" w:themeColor="text1"/>
+          <w:sz w:val="28"/>
+          <w:szCs w:val="28"/>
+        </w:rPr>
+      </w:pPr>
+      <w:r>
+        <w:rPr>
+          <w:color w:val="000000" w:themeColor="text1"/>
+          <w:sz w:val="28"/>
+          <w:szCs w:val="28"/>
+        </w:rPr>
+        <w:t>Danh sách các cá nhân của căn hộ:</w:t>
+      </w:r>
+    </w:p>
+    <w:sdt>
+      <w:sdtPr>
+        <w:rPr>
+          <w:color w:val="000000" w:themeColor="text1"/>
+          <w:sz w:val="28"/>
+          <w:szCs w:val="28"/>
+        </w:rPr>
+        <w:alias w:val="residents"/>
+        <w:tag w:val="list"/>
+        <w:id w:val="-1434207681"/>
+        <w:placeholder>
+          <w:docPart w:val="DefaultPlaceholder_-1854013440"/>
+        </w:placeholder>
+        <w:showingPlcHdr/>
+        <w:text/>
+      </w:sdtPr>
+      <w:sdtContent>
+        <w:p>
+          <w:pPr>
+            <w:spacing w:line="360" w:lineRule="auto"/>
+            <w:contextualSpacing/>
+            <w:jc w:val="both"/>
+            <w:rPr>
+              <w:color w:val="000000" w:themeColor="text1"/>
+              <w:sz w:val="28"/>
+              <w:szCs w:val="28"/>
+            </w:rPr>
+          </w:pPr>
+          <w:sdt>
+            <w:sdtPr>
+              <w:rPr>
+                <w:color w:val="000000" w:themeColor="text1"/>
+                <w:sz w:val="28"/>
+                <w:szCs w:val="28"/>
+              </w:rPr>
+              <w:alias w:val="resident_name"/>
+              <w:tag w:val="text"/>
+              <w:id w:val="-378317752"/>
+              <w:placeholder>
+                <w:docPart w:val="9622CFAE674D4035981766CBD6CECA60"/>
+              </w:placeholder>
+              <w:showingPlcHdr/>
+              <w:text/>
+            </w:sdtPr>
+            <w:sdtContent>
+              <w:r>
+                <w:rPr>
+                  <w:rStyle w:val="PlaceholderText"/>
+                  <w:color w:val="000000" w:themeColor="text1"/>
+                  <w:sz w:val="28"/>
+                  <w:szCs w:val="28"/>
+                </w:rPr>
+                <w:t>Click or tap here to enter text.</w:t>
+              </w:r>
+            </w:sdtContent>
+          </w:sdt>
+          <w:r>
+            <w:rPr>
+              <w:color w:val="000000" w:themeColor="text1"/>
+              <w:sz w:val="28"/>
+              <w:szCs w:val="28"/>
+            </w:rPr>
+            <w:t xml:space="preserve"> - </w:t>
+          </w:r>
+          <w:sdt>
+            <w:sdtPr>
+              <w:rPr>
+                <w:color w:val="000000" w:themeColor="text1"/>
+                <w:sz w:val="28"/>
+                <w:szCs w:val="28"/>
+              </w:rPr>
+              <w:alias w:val="resident_cccd"/>
+              <w:tag w:val="text"/>
+              <w:id w:val="430404762"/>
+              <w:placeholder>
+                <w:docPart w:val="FDD1282F24FC4B829AC0ABA83AB22B19"/>
+              </w:placeholder>
+              <w:showingPlcHdr/>
+              <w:text/>
+            </w:sdtPr>
+            <w:sdtContent>
+              <w:r>
+                <w:rPr>
+                  <w:rStyle w:val="PlaceholderText"/>
+                  <w:color w:val="000000" w:themeColor="text1"/>
+                  <w:sz w:val="28"/>
+                  <w:szCs w:val="28"/>
+                </w:rPr>
+                <w:t>Click or tap here to enter text.</w:t>
+              </w:r>
+            </w:sdtContent>
+          </w:sdt>
+          <w:r>
+            <w:rPr>
+              <w:color w:val="000000" w:themeColor="text1"/>
+              <w:sz w:val="28"/>
+              <w:szCs w:val="28"/>
+            </w:rPr>
+            <w:t xml:space="preserve"> - </w:t>
+          </w:r>
+          <w:sdt>
+            <w:sdtPr>
+              <w:rPr>
+                <w:color w:val="000000" w:themeColor="text1"/>
+                <w:sz w:val="28"/>
+                <w:szCs w:val="28"/>
+              </w:rPr>
+              <w:alias w:val="resident_phone"/>
+              <w:tag w:val="text"/>
+              <w:id w:val="1403485673"/>
+              <w:placeholder>
+                <w:docPart w:val="C99A9A77E8F7443585B2DC69DC3F7AAA"/>
+              </w:placeholder>
+              <w:showingPlcHdr/>
+              <w:text/>
+            </w:sdtPr>
+            <w:sdtContent>
+              <w:r>
+                <w:rPr>
+                  <w:rStyle w:val="PlaceholderText"/>
+                  <w:color w:val="000000" w:themeColor="text1"/>
+                  <w:sz w:val="28"/>
+                  <w:szCs w:val="28"/>
+                </w:rPr>
+                <w:t>Click or tap here to enter text.</w:t>
+              </w:r>
+            </w:sdtContent>
+          </w:sdt>
+          <w:r>
+            <w:rPr>
+              <w:color w:val="000000" w:themeColor="text1"/>
+              <w:sz w:val="28"/>
+              <w:szCs w:val="28"/>
+            </w:rPr>
+            <w:t xml:space="preserve"> -  </w:t>
+          </w:r>
+          <w:sdt>
+            <w:sdtPr>
+              <w:rPr>
+                <w:color w:val="000000" w:themeColor="text1"/>
+                <w:sz w:val="28"/>
+                <w:szCs w:val="28"/>
+              </w:rPr>
+              <w:alias w:val="resident_gender"/>
+              <w:tag w:val="text"/>
+              <w:id w:val="-1647114016"/>
+              <w:placeholder>
+                <w:docPart w:val="0CC4DC1991D94863B8F7B911DA2CBF18"/>
+              </w:placeholder>
+              <w:showingPlcHdr/>
+              <w:text/>
+            </w:sdtPr>
+            <w:sdtContent>
+              <w:r>
+                <w:rPr>
+                  <w:rStyle w:val="PlaceholderText"/>
+                  <w:color w:val="000000" w:themeColor="text1"/>
+                  <w:sz w:val="28"/>
+                  <w:szCs w:val="28"/>
+                </w:rPr>
+                <w:t>Click or tap here to enter text.</w:t>
+              </w:r>
+            </w:sdtContent>
+          </w:sdt>
+          <w:r>
+            <w:rPr>
+              <w:color w:val="000000" w:themeColor="text1"/>
+              <w:sz w:val="28"/>
+              <w:szCs w:val="28"/>
+            </w:rPr>
+            <w:t xml:space="preserve"> - </w:t>
+          </w:r>
+          <w:sdt>
+            <w:sdtPr>
+              <w:rPr>
+                <w:color w:val="000000" w:themeColor="text1"/>
+                <w:sz w:val="28"/>
+                <w:szCs w:val="28"/>
+              </w:rPr>
+              <w:alias w:val="resident_email"/>
+              <w:tag w:val="text"/>
+              <w:id w:val="-1679728391"/>
+              <w:placeholder>
+                <w:docPart w:val="87E0A4C4825D4399A8DF77A49BB4C6B8"/>
+              </w:placeholder>
+              <w:showingPlcHdr/>
+              <w:text/>
+            </w:sdtPr>
+            <w:sdtContent>
+              <w:r>
+                <w:rPr>
+                  <w:rStyle w:val="PlaceholderText"/>
+                  <w:color w:val="000000" w:themeColor="text1"/>
+                  <w:sz w:val="28"/>
+                  <w:szCs w:val="28"/>
+                </w:rPr>
+                <w:t>Click or tap here to enter text.</w:t>
+              </w:r>
+            </w:sdtContent>
+          </w:sdt>
+          <w:r>
+            <w:rPr>
+              <w:color w:val="000000" w:themeColor="text1"/>
+              <w:sz w:val="28"/>
+              <w:szCs w:val="28"/>
+            </w:rPr>
+            <w:t xml:space="preserve"> - </w:t>
+          </w:r>
+          <w:sdt>
+            <w:sdtPr>
+              <w:rPr>
+                <w:color w:val="000000" w:themeColor="text1"/>
+                <w:sz w:val="28"/>
+                <w:szCs w:val="28"/>
+              </w:rPr>
+              <w:alias w:val="resident_birthdate"/>
+              <w:tag w:val="text"/>
+              <w:id w:val="-1597012946"/>
+              <w:placeholder>
+                <w:docPart w:val="29358427A07F4C149139741D077299F9"/>
+              </w:placeholder>
+              <w:showingPlcHdr/>
+              <w:text/>
+            </w:sdtPr>
+            <w:sdtContent>
+              <w:r>
+                <w:rPr>
+                  <w:rStyle w:val="PlaceholderText"/>
+                  <w:color w:val="000000" w:themeColor="text1"/>
+                  <w:sz w:val="28"/>
+                  <w:szCs w:val="28"/>
+                </w:rPr>
+                <w:t>Click or tap here to enter text.</w:t>
+              </w:r>
+            </w:sdtContent>
+          </w:sdt>
+          <w:r>
+            <w:rPr>
+              <w:color w:val="000000" w:themeColor="text1"/>
+              <w:sz w:val="28"/>
+              <w:szCs w:val="28"/>
+            </w:rPr>
+            <w:t xml:space="preserve"> -  </w:t>
+          </w:r>
+          <w:sdt>
+            <w:sdtPr>
+              <w:rPr>
+                <w:color w:val="000000" w:themeColor="text1"/>
+                <w:sz w:val="28"/>
+                <w:szCs w:val="28"/>
+              </w:rPr>
+              <w:alias w:val="resident_address"/>
+              <w:tag w:val="text"/>
+              <w:id w:val="-1192292975"/>
+              <w:placeholder>
+                <w:docPart w:val="D4FC99FBB63D4206AC435DDD9218411F"/>
+              </w:placeholder>
+              <w:showingPlcHdr/>
+              <w:text/>
+            </w:sdtPr>
+            <w:sdtContent>
+              <w:r>
+                <w:rPr>
+                  <w:rStyle w:val="PlaceholderText"/>
+                  <w:color w:val="000000" w:themeColor="text1"/>
+                  <w:sz w:val="28"/>
+                  <w:szCs w:val="28"/>
+                </w:rPr>
+                <w:t>Click or tap here to enter text.</w:t>
+              </w:r>
+            </w:sdtContent>
+          </w:sdt>
+        </w:p>
+      </w:sdtContent>
+    </w:sdt>
+    <w:p>
+      <w:pPr>
+        <w:spacing w:line="360" w:lineRule="auto"/>
+        <w:contextualSpacing/>
+        <w:jc w:val="both"/>
+        <w:rPr>
+          <w:color w:val="000000" w:themeColor="text1"/>
+          <w:sz w:val="28"/>
+          <w:szCs w:val="28"/>
+        </w:rPr>
+      </w:pPr>
+    </w:p>
+    <w:p>
+      <w:pPr>
         <w:numPr>
           <w:ilvl w:val="0"/>
           <w:numId w:val="15"/>
@@ -690,6 +1009,7 @@
           <w:sz w:val="28"/>
           <w:szCs w:val="28"/>
         </w:rPr>
+        <w:lastRenderedPageBreak/>
         <w:t>BÊN CUNG CẤP DỊCH VỤ QUẢN LÝ (Sau đây gọi tắt là “Bên B”)</w:t>
       </w:r>
     </w:p>
@@ -919,7 +1239,6 @@
           <w:sz w:val="28"/>
           <w:szCs w:val="28"/>
         </w:rPr>
-        <w:lastRenderedPageBreak/>
         <w:t>(Bên A và Bên B gọi riêng là “Bên” và gọi chung là “Các Bên”)</w:t>
       </w:r>
     </w:p>
@@ -2161,7 +2480,16 @@
           <w:sz w:val="28"/>
           <w:szCs w:val="28"/>
         </w:rPr>
-        <w:t xml:space="preserve">ồng (nếu có) sẽ được </w:t>
+        <w:t xml:space="preserve">ồng </w:t>
+      </w:r>
+      <w:r>
+        <w:rPr>
+          <w:color w:val="000000" w:themeColor="text1"/>
+          <w:sz w:val="28"/>
+          <w:szCs w:val="28"/>
+        </w:rPr>
+        <w:lastRenderedPageBreak/>
+        <w:t xml:space="preserve">(nếu có) sẽ được </w:t>
       </w:r>
       <w:r>
         <w:rPr>
@@ -2650,7 +2978,6 @@
           <w:sz w:val="28"/>
           <w:szCs w:val="28"/>
         </w:rPr>
-        <w:lastRenderedPageBreak/>
         <w:t xml:space="preserve">Trong trường hợp hết 180 ngày kể từ ngày cuối cùng của </w:t>
       </w:r>
       <w:r>
@@ -3768,6 +4095,7 @@
           <w:sz w:val="28"/>
           <w:szCs w:val="28"/>
         </w:rPr>
+        <w:lastRenderedPageBreak/>
         <w:t xml:space="preserve">Trong trường hợp có sự thay đổi về chính sách tiền lương do </w:t>
       </w:r>
       <w:r>
@@ -4231,7 +4559,6 @@
           <w:sz w:val="28"/>
           <w:szCs w:val="28"/>
         </w:rPr>
-        <w:lastRenderedPageBreak/>
         <w:t xml:space="preserve">Trường hợp </w:t>
       </w:r>
       <w:r>
@@ -5058,6 +5385,7 @@
           <w:sz w:val="28"/>
           <w:szCs w:val="28"/>
         </w:rPr>
+        <w:lastRenderedPageBreak/>
         <w:t xml:space="preserve">Thu xếp và đảm bảo </w:t>
       </w:r>
       <w:r>
@@ -5414,7 +5742,6 @@
           <w:sz w:val="28"/>
           <w:szCs w:val="28"/>
         </w:rPr>
-        <w:lastRenderedPageBreak/>
         <w:t xml:space="preserve">Trong trường hợp </w:t>
       </w:r>
       <w:r>
@@ -6189,6 +6516,7 @@
           <w:sz w:val="28"/>
           <w:szCs w:val="28"/>
         </w:rPr>
+        <w:lastRenderedPageBreak/>
         <w:t xml:space="preserve">Bố trí hoặc thuyên chuyển bất kỳ nhân viên nào đang làm việc cho </w:t>
       </w:r>
       <w:r>
@@ -6801,7 +7129,6 @@
           <w:sz w:val="28"/>
           <w:szCs w:val="28"/>
         </w:rPr>
-        <w:lastRenderedPageBreak/>
         <w:t xml:space="preserve">Có quyền ngừng cung cấp dịch vụ quản lý vận hành đối với </w:t>
       </w:r>
       <w:r>
@@ -7591,6 +7918,7 @@
           <w:sz w:val="28"/>
           <w:szCs w:val="28"/>
         </w:rPr>
+        <w:lastRenderedPageBreak/>
         <w:t>Cử nhân viên kỹ thuật để xử lý các sự cố phát sinh/ được thông báo trong thời hạn …. (….)</w:t>
       </w:r>
       <w:r>
@@ -7831,7 +8159,6 @@
           <w:sz w:val="28"/>
           <w:szCs w:val="28"/>
         </w:rPr>
-        <w:lastRenderedPageBreak/>
         <w:t xml:space="preserve">Quản lý, sử dụng có hiệu quả, đúng mục đích các tài liệu, thiết bị và các tài sản do </w:t>
       </w:r>
       <w:r>
@@ -8573,6 +8900,7 @@
           <w:sz w:val="28"/>
           <w:szCs w:val="28"/>
         </w:rPr>
+        <w:lastRenderedPageBreak/>
         <w:t xml:space="preserve">Sự Kiện Bất Khả Kháng là tất cả những sự kiện xảy ra một cách khách quan không thể lường trước được và không thể khắc phục được mặc dù đã áp dụng mọi biện pháp cần thiết và khả năng cho phép. Các khó khăn về tài chính đơn thuần dẫn đến việc không thanh toán hoặc không thanh toán đủ </w:t>
       </w:r>
       <w:r>
@@ -8745,16 +9073,7 @@
           <w:sz w:val="28"/>
           <w:szCs w:val="28"/>
         </w:rPr>
-        <w:t xml:space="preserve">ên đó đã áp dụng các biện pháp hợp lý để giảm thiểu sự chậm trễ hay các tổn thất phát sinh và phải thông báo kịp thời về Sự Kiện Bất Khả Kháng cũng như việc không thực hiện hoặc chậm thực hiện nghĩa vụ của mình </w:t>
-      </w:r>
-      <w:r>
-        <w:rPr>
-          <w:color w:val="000000" w:themeColor="text1"/>
-          <w:sz w:val="28"/>
-          <w:szCs w:val="28"/>
-        </w:rPr>
-        <w:lastRenderedPageBreak/>
-        <w:t xml:space="preserve">cho </w:t>
+        <w:t xml:space="preserve">ên đó đã áp dụng các biện pháp hợp lý để giảm thiểu sự chậm trễ hay các tổn thất phát sinh và phải thông báo kịp thời về Sự Kiện Bất Khả Kháng cũng như việc không thực hiện hoặc chậm thực hiện nghĩa vụ của mình cho </w:t>
       </w:r>
       <w:r>
         <w:rPr>
@@ -9553,7 +9872,16 @@
           <w:sz w:val="28"/>
           <w:szCs w:val="28"/>
         </w:rPr>
-        <w:t xml:space="preserve">hung còn lại là …% được sử dụng để phục vụ cho việc quản lý vận hành tại </w:t>
+        <w:t xml:space="preserve">hung còn lại là …% được sử dụng để </w:t>
+      </w:r>
+      <w:r>
+        <w:rPr>
+          <w:color w:val="000000" w:themeColor="text1"/>
+          <w:sz w:val="28"/>
+          <w:szCs w:val="28"/>
+        </w:rPr>
+        <w:lastRenderedPageBreak/>
+        <w:t xml:space="preserve">phục vụ cho việc quản lý vận hành tại </w:t>
       </w:r>
       <w:r>
         <w:rPr>
@@ -10033,7 +10361,6 @@
           <w:sz w:val="28"/>
           <w:szCs w:val="28"/>
         </w:rPr>
-        <w:lastRenderedPageBreak/>
         <w:t xml:space="preserve">Khi một </w:t>
       </w:r>
       <w:r>
@@ -17802,6 +18129,209 @@
         </w:p>
       </w:docPartBody>
     </w:docPart>
+    <w:docPart>
+      <w:docPartPr>
+        <w:name w:val="9622CFAE674D4035981766CBD6CECA60"/>
+        <w:category>
+          <w:name w:val="General"/>
+          <w:gallery w:val="placeholder"/>
+        </w:category>
+        <w:types>
+          <w:type w:val="bbPlcHdr"/>
+        </w:types>
+        <w:behaviors>
+          <w:behavior w:val="content"/>
+        </w:behaviors>
+        <w:guid w:val="{F3A14930-70A1-4584-9A9E-E17813E9073B}"/>
+      </w:docPartPr>
+      <w:docPartBody>
+        <w:p>
+          <w:pPr>
+            <w:pStyle w:val="9622CFAE674D4035981766CBD6CECA60"/>
+          </w:pPr>
+          <w:r>
+            <w:rPr>
+              <w:rStyle w:val="PlaceholderText"/>
+            </w:rPr>
+            <w:t>Click or tap here to enter text.</w:t>
+          </w:r>
+        </w:p>
+      </w:docPartBody>
+    </w:docPart>
+    <w:docPart>
+      <w:docPartPr>
+        <w:name w:val="0CC4DC1991D94863B8F7B911DA2CBF18"/>
+        <w:category>
+          <w:name w:val="General"/>
+          <w:gallery w:val="placeholder"/>
+        </w:category>
+        <w:types>
+          <w:type w:val="bbPlcHdr"/>
+        </w:types>
+        <w:behaviors>
+          <w:behavior w:val="content"/>
+        </w:behaviors>
+        <w:guid w:val="{C74556B3-D4A2-44EC-AFFF-AB6A9094F594}"/>
+      </w:docPartPr>
+      <w:docPartBody>
+        <w:p>
+          <w:pPr>
+            <w:pStyle w:val="0CC4DC1991D94863B8F7B911DA2CBF18"/>
+          </w:pPr>
+          <w:r>
+            <w:rPr>
+              <w:rStyle w:val="PlaceholderText"/>
+            </w:rPr>
+            <w:t>Click or tap here to enter text.</w:t>
+          </w:r>
+        </w:p>
+      </w:docPartBody>
+    </w:docPart>
+    <w:docPart>
+      <w:docPartPr>
+        <w:name w:val="D4FC99FBB63D4206AC435DDD9218411F"/>
+        <w:category>
+          <w:name w:val="General"/>
+          <w:gallery w:val="placeholder"/>
+        </w:category>
+        <w:types>
+          <w:type w:val="bbPlcHdr"/>
+        </w:types>
+        <w:behaviors>
+          <w:behavior w:val="content"/>
+        </w:behaviors>
+        <w:guid w:val="{638DEAB3-87D7-451C-A72E-B247B64EE39E}"/>
+      </w:docPartPr>
+      <w:docPartBody>
+        <w:p>
+          <w:pPr>
+            <w:pStyle w:val="D4FC99FBB63D4206AC435DDD9218411F"/>
+          </w:pPr>
+          <w:r>
+            <w:rPr>
+              <w:rStyle w:val="PlaceholderText"/>
+            </w:rPr>
+            <w:t>Click or tap here to enter text.</w:t>
+          </w:r>
+        </w:p>
+      </w:docPartBody>
+    </w:docPart>
+    <w:docPart>
+      <w:docPartPr>
+        <w:name w:val="87E0A4C4825D4399A8DF77A49BB4C6B8"/>
+        <w:category>
+          <w:name w:val="General"/>
+          <w:gallery w:val="placeholder"/>
+        </w:category>
+        <w:types>
+          <w:type w:val="bbPlcHdr"/>
+        </w:types>
+        <w:behaviors>
+          <w:behavior w:val="content"/>
+        </w:behaviors>
+        <w:guid w:val="{70006954-C388-4C39-AD71-AEF8780D2E62}"/>
+      </w:docPartPr>
+      <w:docPartBody>
+        <w:p>
+          <w:pPr>
+            <w:pStyle w:val="87E0A4C4825D4399A8DF77A49BB4C6B8"/>
+          </w:pPr>
+          <w:r>
+            <w:rPr>
+              <w:rStyle w:val="PlaceholderText"/>
+            </w:rPr>
+            <w:t>Click or tap here to enter text.</w:t>
+          </w:r>
+        </w:p>
+      </w:docPartBody>
+    </w:docPart>
+    <w:docPart>
+      <w:docPartPr>
+        <w:name w:val="29358427A07F4C149139741D077299F9"/>
+        <w:category>
+          <w:name w:val="General"/>
+          <w:gallery w:val="placeholder"/>
+        </w:category>
+        <w:types>
+          <w:type w:val="bbPlcHdr"/>
+        </w:types>
+        <w:behaviors>
+          <w:behavior w:val="content"/>
+        </w:behaviors>
+        <w:guid w:val="{A1139EC6-F950-49B9-BA78-1522610930B8}"/>
+      </w:docPartPr>
+      <w:docPartBody>
+        <w:p>
+          <w:pPr>
+            <w:pStyle w:val="29358427A07F4C149139741D077299F9"/>
+          </w:pPr>
+          <w:r>
+            <w:rPr>
+              <w:rStyle w:val="PlaceholderText"/>
+            </w:rPr>
+            <w:t>Click or tap here to enter text.</w:t>
+          </w:r>
+        </w:p>
+      </w:docPartBody>
+    </w:docPart>
+    <w:docPart>
+      <w:docPartPr>
+        <w:name w:val="FDD1282F24FC4B829AC0ABA83AB22B19"/>
+        <w:category>
+          <w:name w:val="General"/>
+          <w:gallery w:val="placeholder"/>
+        </w:category>
+        <w:types>
+          <w:type w:val="bbPlcHdr"/>
+        </w:types>
+        <w:behaviors>
+          <w:behavior w:val="content"/>
+        </w:behaviors>
+        <w:guid w:val="{7944291F-4E2E-403D-9FE6-7076A49A0A41}"/>
+      </w:docPartPr>
+      <w:docPartBody>
+        <w:p>
+          <w:pPr>
+            <w:pStyle w:val="FDD1282F24FC4B829AC0ABA83AB22B19"/>
+          </w:pPr>
+          <w:r>
+            <w:rPr>
+              <w:rStyle w:val="PlaceholderText"/>
+            </w:rPr>
+            <w:t>Click or tap here to enter text.</w:t>
+          </w:r>
+        </w:p>
+      </w:docPartBody>
+    </w:docPart>
+    <w:docPart>
+      <w:docPartPr>
+        <w:name w:val="C99A9A77E8F7443585B2DC69DC3F7AAA"/>
+        <w:category>
+          <w:name w:val="General"/>
+          <w:gallery w:val="placeholder"/>
+        </w:category>
+        <w:types>
+          <w:type w:val="bbPlcHdr"/>
+        </w:types>
+        <w:behaviors>
+          <w:behavior w:val="content"/>
+        </w:behaviors>
+        <w:guid w:val="{6A4CC110-A583-4E07-8A79-E95C3109BCBC}"/>
+      </w:docPartPr>
+      <w:docPartBody>
+        <w:p>
+          <w:pPr>
+            <w:pStyle w:val="C99A9A77E8F7443585B2DC69DC3F7AAA"/>
+          </w:pPr>
+          <w:r>
+            <w:rPr>
+              <w:rStyle w:val="PlaceholderText"/>
+            </w:rPr>
+            <w:t>Click or tap here to enter text.</w:t>
+          </w:r>
+        </w:p>
+      </w:docPartBody>
+    </w:docPart>
   </w:docParts>
 </w:glossaryDocument>
 </file>
@@ -17887,7 +18417,9 @@
     <w:rsid w:val="000877A5"/>
     <w:rsid w:val="00144AED"/>
     <w:rsid w:val="001D169B"/>
+    <w:rsid w:val="002175C6"/>
     <w:rsid w:val="00217F6A"/>
+    <w:rsid w:val="00337BDD"/>
     <w:rsid w:val="00390AE5"/>
     <w:rsid w:val="004B0F81"/>
     <w:rsid w:val="004B2F72"/>
@@ -17897,6 +18429,7 @@
     <w:rsid w:val="00A20BD7"/>
     <w:rsid w:val="00AF5A7C"/>
     <w:rsid w:val="00C516ED"/>
+    <w:rsid w:val="00F17ACF"/>
     <w:rsid w:val="00FF5930"/>
   </w:rsids>
   <m:mathPr>
@@ -18353,7 +18886,7 @@
     <w:basedOn w:val="DefaultParagraphFont"/>
     <w:uiPriority w:val="99"/>
     <w:semiHidden/>
-    <w:rsid w:val="000877A5"/>
+    <w:rsid w:val="002175C6"/>
     <w:rPr>
       <w:color w:val="666666"/>
     </w:rPr>
@@ -18401,6 +18934,34 @@
   <w:style w:type="paragraph" w:customStyle="1" w:styleId="6C1AE95BE4604657A311845165DD5A7E">
     <w:name w:val="6C1AE95BE4604657A311845165DD5A7E"/>
     <w:rsid w:val="000877A5"/>
+  </w:style>
+  <w:style w:type="paragraph" w:customStyle="1" w:styleId="9622CFAE674D4035981766CBD6CECA60">
+    <w:name w:val="9622CFAE674D4035981766CBD6CECA60"/>
+    <w:rsid w:val="002175C6"/>
+  </w:style>
+  <w:style w:type="paragraph" w:customStyle="1" w:styleId="0CC4DC1991D94863B8F7B911DA2CBF18">
+    <w:name w:val="0CC4DC1991D94863B8F7B911DA2CBF18"/>
+    <w:rsid w:val="002175C6"/>
+  </w:style>
+  <w:style w:type="paragraph" w:customStyle="1" w:styleId="D4FC99FBB63D4206AC435DDD9218411F">
+    <w:name w:val="D4FC99FBB63D4206AC435DDD9218411F"/>
+    <w:rsid w:val="002175C6"/>
+  </w:style>
+  <w:style w:type="paragraph" w:customStyle="1" w:styleId="87E0A4C4825D4399A8DF77A49BB4C6B8">
+    <w:name w:val="87E0A4C4825D4399A8DF77A49BB4C6B8"/>
+    <w:rsid w:val="002175C6"/>
+  </w:style>
+  <w:style w:type="paragraph" w:customStyle="1" w:styleId="29358427A07F4C149139741D077299F9">
+    <w:name w:val="29358427A07F4C149139741D077299F9"/>
+    <w:rsid w:val="002175C6"/>
+  </w:style>
+  <w:style w:type="paragraph" w:customStyle="1" w:styleId="FDD1282F24FC4B829AC0ABA83AB22B19">
+    <w:name w:val="FDD1282F24FC4B829AC0ABA83AB22B19"/>
+    <w:rsid w:val="002175C6"/>
+  </w:style>
+  <w:style w:type="paragraph" w:customStyle="1" w:styleId="C99A9A77E8F7443585B2DC69DC3F7AAA">
+    <w:name w:val="C99A9A77E8F7443585B2DC69DC3F7AAA"/>
+    <w:rsid w:val="002175C6"/>
   </w:style>
 </w:styles>
 </file>

</xml_diff>

<commit_message>
Day 49: fix loi nho cua cac giao dien, hoan thien giao dien thong ke
</commit_message>
<xml_diff>
--- a/assets/templates/hd_dichvu.docx
+++ b/assets/templates/hd_dichvu.docx
@@ -83,8 +83,8 @@
           <w:b/>
           <w:bCs/>
           <w:color w:val="000000" w:themeColor="text1"/>
-          <w:sz w:val="28"/>
-          <w:szCs w:val="28"/>
+          <w:sz w:val="32"/>
+          <w:szCs w:val="32"/>
         </w:rPr>
       </w:pPr>
       <w:r>
@@ -92,48 +92,24 @@
           <w:b/>
           <w:bCs/>
           <w:color w:val="000000" w:themeColor="text1"/>
-          <w:sz w:val="28"/>
-          <w:szCs w:val="28"/>
-        </w:rPr>
-        <w:t>HỢP ĐỒNG DỊCH VỤ QUẢN LÝ VẬN HÀNH</w:t>
+          <w:sz w:val="32"/>
+          <w:szCs w:val="32"/>
+        </w:rPr>
+        <w:t xml:space="preserve">HỢP ĐỒNG DỊCH VỤ </w:t>
       </w:r>
     </w:p>
     <w:p>
       <w:pPr>
         <w:spacing w:line="360" w:lineRule="auto"/>
         <w:contextualSpacing/>
-        <w:jc w:val="center"/>
-        <w:rPr>
-          <w:color w:val="000000" w:themeColor="text1"/>
-          <w:sz w:val="28"/>
-          <w:szCs w:val="28"/>
-        </w:rPr>
-      </w:pPr>
-      <w:r>
-        <w:rPr>
-          <w:color w:val="000000" w:themeColor="text1"/>
-          <w:sz w:val="28"/>
-          <w:szCs w:val="28"/>
-        </w:rPr>
-        <w:t>(Số: ……../…/HDDVQL/VHM-….…</w:t>
-      </w:r>
-      <w:r>
-        <w:rPr>
-          <w:color w:val="000000" w:themeColor="text1"/>
-          <w:sz w:val="28"/>
-          <w:szCs w:val="28"/>
-          <w:vertAlign w:val="superscript"/>
-        </w:rPr>
-        <w:footnoteReference w:id="1"/>
-      </w:r>
-      <w:r>
-        <w:rPr>
-          <w:color w:val="000000" w:themeColor="text1"/>
-          <w:sz w:val="28"/>
-          <w:szCs w:val="28"/>
-        </w:rPr>
-        <w:t>)</w:t>
-      </w:r>
+        <w:rPr>
+          <w:b/>
+          <w:bCs/>
+          <w:color w:val="000000" w:themeColor="text1"/>
+          <w:sz w:val="28"/>
+          <w:szCs w:val="28"/>
+        </w:rPr>
+      </w:pPr>
     </w:p>
     <w:p>
       <w:pPr>
@@ -260,7 +236,7 @@
           <w:tag w:val="text"/>
           <w:id w:val="-1906897017"/>
           <w:placeholder>
-            <w:docPart w:val="DefaultPlaceholder_-1854013440"/>
+            <w:docPart w:val="67BEB2BE146445A8AD3A1B3DF91E9594"/>
           </w:placeholder>
           <w:showingPlcHdr/>
           <w:text/>
@@ -354,7 +330,7 @@
           <w:tag w:val="text"/>
           <w:id w:val="-281885372"/>
           <w:placeholder>
-            <w:docPart w:val="DefaultPlaceholder_-1854013440"/>
+            <w:docPart w:val="13FA158C0F1449999A71E60AA9DD28F0"/>
           </w:placeholder>
           <w:showingPlcHdr/>
           <w:text/>
@@ -402,7 +378,7 @@
           <w:tag w:val="text"/>
           <w:id w:val="-622766317"/>
           <w:placeholder>
-            <w:docPart w:val="DefaultPlaceholder_-1854013440"/>
+            <w:docPart w:val="82EF2F2C29E842F1A15AE3E7C2EA61B6"/>
           </w:placeholder>
           <w:showingPlcHdr/>
           <w:text/>
@@ -1009,7 +985,6 @@
           <w:sz w:val="28"/>
           <w:szCs w:val="28"/>
         </w:rPr>
-        <w:lastRenderedPageBreak/>
         <w:t>BÊN CUNG CẤP DỊCH VỤ QUẢN LÝ (Sau đây gọi tắt là “Bên B”)</w:t>
       </w:r>
     </w:p>
@@ -1110,6 +1085,7 @@
           <w:sz w:val="28"/>
           <w:szCs w:val="28"/>
         </w:rPr>
+        <w:lastRenderedPageBreak/>
         <w:t>Đại diện bởi</w:t>
       </w:r>
       <w:r>
@@ -1767,7 +1743,7 @@
           <w:tag w:val="text"/>
           <w:id w:val="557675625"/>
           <w:placeholder>
-            <w:docPart w:val="DefaultPlaceholder_-1854013440"/>
+            <w:docPart w:val="83AD6591847540EC883D4AB5CE7773EA"/>
           </w:placeholder>
           <w:showingPlcHdr/>
           <w:text/>
@@ -1803,7 +1779,7 @@
           <w:tag w:val="text"/>
           <w:id w:val="1117952525"/>
           <w:placeholder>
-            <w:docPart w:val="DefaultPlaceholder_-1854013440"/>
+            <w:docPart w:val="4D5F5C4C105A45658A7D021FC10D15CB"/>
           </w:placeholder>
           <w:showingPlcHdr/>
           <w:text/>
@@ -1839,7 +1815,7 @@
           <w:tag w:val="text"/>
           <w:id w:val="852144547"/>
           <w:placeholder>
-            <w:docPart w:val="DefaultPlaceholder_-1854013440"/>
+            <w:docPart w:val="77F12E82CE194D8D8A3A84854B22C223"/>
           </w:placeholder>
           <w:showingPlcHdr/>
           <w:text/>
@@ -2357,7 +2333,7 @@
           <w:tag w:val="text"/>
           <w:id w:val="437801195"/>
           <w:placeholder>
-            <w:docPart w:val="DefaultPlaceholder_-1854013440"/>
+            <w:docPart w:val="24BC14EA41F84EDCAF7BE3CECE1AE261"/>
           </w:placeholder>
           <w:showingPlcHdr/>
           <w:text/>
@@ -2480,7 +2456,263 @@
           <w:sz w:val="28"/>
           <w:szCs w:val="28"/>
         </w:rPr>
-        <w:t xml:space="preserve">ồng </w:t>
+        <w:t xml:space="preserve">ồng (nếu có) sẽ được </w:t>
+      </w:r>
+      <w:r>
+        <w:rPr>
+          <w:color w:val="000000" w:themeColor="text1"/>
+          <w:sz w:val="28"/>
+          <w:szCs w:val="28"/>
+        </w:rPr>
+        <w:t>c</w:t>
+      </w:r>
+      <w:r>
+        <w:rPr>
+          <w:color w:val="000000" w:themeColor="text1"/>
+          <w:sz w:val="28"/>
+          <w:szCs w:val="28"/>
+        </w:rPr>
+        <w:t xml:space="preserve">ác </w:t>
+      </w:r>
+      <w:r>
+        <w:rPr>
+          <w:color w:val="000000" w:themeColor="text1"/>
+          <w:sz w:val="28"/>
+          <w:szCs w:val="28"/>
+        </w:rPr>
+        <w:t>b</w:t>
+      </w:r>
+      <w:r>
+        <w:rPr>
+          <w:color w:val="000000" w:themeColor="text1"/>
+          <w:sz w:val="28"/>
+          <w:szCs w:val="28"/>
+        </w:rPr>
+        <w:t xml:space="preserve">ên thỏa thuận bằng văn bản trước ít nhất 30 (ba mươi) ngày làm việc so với ngày cuối cùng của </w:t>
+      </w:r>
+      <w:r>
+        <w:rPr>
+          <w:color w:val="000000" w:themeColor="text1"/>
+          <w:sz w:val="28"/>
+          <w:szCs w:val="28"/>
+        </w:rPr>
+        <w:t>t</w:t>
+      </w:r>
+      <w:r>
+        <w:rPr>
+          <w:color w:val="000000" w:themeColor="text1"/>
+          <w:sz w:val="28"/>
+          <w:szCs w:val="28"/>
+        </w:rPr>
+        <w:t xml:space="preserve">hời </w:t>
+      </w:r>
+      <w:r>
+        <w:rPr>
+          <w:color w:val="000000" w:themeColor="text1"/>
+          <w:sz w:val="28"/>
+          <w:szCs w:val="28"/>
+        </w:rPr>
+        <w:t>h</w:t>
+      </w:r>
+      <w:r>
+        <w:rPr>
+          <w:color w:val="000000" w:themeColor="text1"/>
+          <w:sz w:val="28"/>
+          <w:szCs w:val="28"/>
+        </w:rPr>
+        <w:t xml:space="preserve">ạn hoặc </w:t>
+      </w:r>
+      <w:r>
+        <w:rPr>
+          <w:color w:val="000000" w:themeColor="text1"/>
+          <w:sz w:val="28"/>
+          <w:szCs w:val="28"/>
+        </w:rPr>
+        <w:t>t</w:t>
+      </w:r>
+      <w:r>
+        <w:rPr>
+          <w:color w:val="000000" w:themeColor="text1"/>
+          <w:sz w:val="28"/>
+          <w:szCs w:val="28"/>
+        </w:rPr>
+        <w:t xml:space="preserve">hời </w:t>
+      </w:r>
+      <w:r>
+        <w:rPr>
+          <w:color w:val="000000" w:themeColor="text1"/>
+          <w:sz w:val="28"/>
+          <w:szCs w:val="28"/>
+        </w:rPr>
+        <w:t>h</w:t>
+      </w:r>
+      <w:r>
+        <w:rPr>
+          <w:color w:val="000000" w:themeColor="text1"/>
+          <w:sz w:val="28"/>
+          <w:szCs w:val="28"/>
+        </w:rPr>
+        <w:t xml:space="preserve">ạn đã gia hạn liền trước đó. Để cho rõ ràng, trong trường hợp </w:t>
+      </w:r>
+      <w:r>
+        <w:rPr>
+          <w:color w:val="000000" w:themeColor="text1"/>
+          <w:sz w:val="28"/>
+          <w:szCs w:val="28"/>
+        </w:rPr>
+        <w:t>c</w:t>
+      </w:r>
+      <w:r>
+        <w:rPr>
+          <w:color w:val="000000" w:themeColor="text1"/>
+          <w:sz w:val="28"/>
+          <w:szCs w:val="28"/>
+        </w:rPr>
+        <w:t xml:space="preserve">ác </w:t>
+      </w:r>
+      <w:r>
+        <w:rPr>
+          <w:color w:val="000000" w:themeColor="text1"/>
+          <w:sz w:val="28"/>
+          <w:szCs w:val="28"/>
+        </w:rPr>
+        <w:t>b</w:t>
+      </w:r>
+      <w:r>
+        <w:rPr>
+          <w:color w:val="000000" w:themeColor="text1"/>
+          <w:sz w:val="28"/>
+          <w:szCs w:val="28"/>
+        </w:rPr>
+        <w:t xml:space="preserve">ên đã thể hiện rõ ý chí về việc gia hạn </w:t>
+      </w:r>
+      <w:r>
+        <w:rPr>
+          <w:color w:val="000000" w:themeColor="text1"/>
+          <w:sz w:val="28"/>
+          <w:szCs w:val="28"/>
+        </w:rPr>
+        <w:t>t</w:t>
+      </w:r>
+      <w:r>
+        <w:rPr>
+          <w:color w:val="000000" w:themeColor="text1"/>
+          <w:sz w:val="28"/>
+          <w:szCs w:val="28"/>
+        </w:rPr>
+        <w:t xml:space="preserve">hời </w:t>
+      </w:r>
+      <w:r>
+        <w:rPr>
+          <w:color w:val="000000" w:themeColor="text1"/>
+          <w:sz w:val="28"/>
+          <w:szCs w:val="28"/>
+        </w:rPr>
+        <w:t>h</w:t>
+      </w:r>
+      <w:r>
+        <w:rPr>
+          <w:color w:val="000000" w:themeColor="text1"/>
+          <w:sz w:val="28"/>
+          <w:szCs w:val="28"/>
+        </w:rPr>
+        <w:t xml:space="preserve">ạn bằng việc vẫn tiếp tục cung cấp và sử dụng </w:t>
+      </w:r>
+      <w:r>
+        <w:rPr>
+          <w:color w:val="000000" w:themeColor="text1"/>
+          <w:sz w:val="28"/>
+          <w:szCs w:val="28"/>
+        </w:rPr>
+        <w:t>d</w:t>
+      </w:r>
+      <w:r>
+        <w:rPr>
+          <w:color w:val="000000" w:themeColor="text1"/>
+          <w:sz w:val="28"/>
+          <w:szCs w:val="28"/>
+        </w:rPr>
+        <w:t xml:space="preserve">ịch </w:t>
+      </w:r>
+      <w:r>
+        <w:rPr>
+          <w:color w:val="000000" w:themeColor="text1"/>
+          <w:sz w:val="28"/>
+          <w:szCs w:val="28"/>
+        </w:rPr>
+        <w:t>v</w:t>
+      </w:r>
+      <w:r>
+        <w:rPr>
+          <w:color w:val="000000" w:themeColor="text1"/>
+          <w:sz w:val="28"/>
+          <w:szCs w:val="28"/>
+        </w:rPr>
+        <w:t xml:space="preserve">ụ trên thực tế trong thời gian nêu trên nhưng chưa hoàn tất thủ tục ký kết phụ lục về việc gia hạn </w:t>
+      </w:r>
+      <w:r>
+        <w:rPr>
+          <w:color w:val="000000" w:themeColor="text1"/>
+          <w:sz w:val="28"/>
+          <w:szCs w:val="28"/>
+        </w:rPr>
+        <w:t>h</w:t>
+      </w:r>
+      <w:r>
+        <w:rPr>
+          <w:color w:val="000000" w:themeColor="text1"/>
+          <w:sz w:val="28"/>
+          <w:szCs w:val="28"/>
+        </w:rPr>
+        <w:t xml:space="preserve">ợp </w:t>
+      </w:r>
+      <w:r>
+        <w:rPr>
+          <w:color w:val="000000" w:themeColor="text1"/>
+          <w:sz w:val="28"/>
+          <w:szCs w:val="28"/>
+        </w:rPr>
+        <w:t>đ</w:t>
+      </w:r>
+      <w:r>
+        <w:rPr>
+          <w:color w:val="000000" w:themeColor="text1"/>
+          <w:sz w:val="28"/>
+          <w:szCs w:val="28"/>
+        </w:rPr>
+        <w:t xml:space="preserve">ồng thì </w:t>
+      </w:r>
+      <w:r>
+        <w:rPr>
+          <w:color w:val="000000" w:themeColor="text1"/>
+          <w:sz w:val="28"/>
+          <w:szCs w:val="28"/>
+        </w:rPr>
+        <w:t>h</w:t>
+      </w:r>
+      <w:r>
+        <w:rPr>
+          <w:color w:val="000000" w:themeColor="text1"/>
+          <w:sz w:val="28"/>
+          <w:szCs w:val="28"/>
+        </w:rPr>
+        <w:t xml:space="preserve">ợp </w:t>
+      </w:r>
+      <w:r>
+        <w:rPr>
+          <w:color w:val="000000" w:themeColor="text1"/>
+          <w:sz w:val="28"/>
+          <w:szCs w:val="28"/>
+        </w:rPr>
+        <w:t>đ</w:t>
+      </w:r>
+      <w:r>
+        <w:rPr>
+          <w:color w:val="000000" w:themeColor="text1"/>
+          <w:sz w:val="28"/>
+          <w:szCs w:val="28"/>
+        </w:rPr>
+        <w:t xml:space="preserve">ồng được xem là </w:t>
       </w:r>
       <w:r>
         <w:rPr>
@@ -2489,263 +2721,7 @@
           <w:szCs w:val="28"/>
         </w:rPr>
         <w:lastRenderedPageBreak/>
-        <w:t xml:space="preserve">(nếu có) sẽ được </w:t>
-      </w:r>
-      <w:r>
-        <w:rPr>
-          <w:color w:val="000000" w:themeColor="text1"/>
-          <w:sz w:val="28"/>
-          <w:szCs w:val="28"/>
-        </w:rPr>
-        <w:t>c</w:t>
-      </w:r>
-      <w:r>
-        <w:rPr>
-          <w:color w:val="000000" w:themeColor="text1"/>
-          <w:sz w:val="28"/>
-          <w:szCs w:val="28"/>
-        </w:rPr>
-        <w:t xml:space="preserve">ác </w:t>
-      </w:r>
-      <w:r>
-        <w:rPr>
-          <w:color w:val="000000" w:themeColor="text1"/>
-          <w:sz w:val="28"/>
-          <w:szCs w:val="28"/>
-        </w:rPr>
-        <w:t>b</w:t>
-      </w:r>
-      <w:r>
-        <w:rPr>
-          <w:color w:val="000000" w:themeColor="text1"/>
-          <w:sz w:val="28"/>
-          <w:szCs w:val="28"/>
-        </w:rPr>
-        <w:t xml:space="preserve">ên thỏa thuận bằng văn bản trước ít nhất 30 (ba mươi) ngày làm việc so với ngày cuối cùng của </w:t>
-      </w:r>
-      <w:r>
-        <w:rPr>
-          <w:color w:val="000000" w:themeColor="text1"/>
-          <w:sz w:val="28"/>
-          <w:szCs w:val="28"/>
-        </w:rPr>
-        <w:t>t</w:t>
-      </w:r>
-      <w:r>
-        <w:rPr>
-          <w:color w:val="000000" w:themeColor="text1"/>
-          <w:sz w:val="28"/>
-          <w:szCs w:val="28"/>
-        </w:rPr>
-        <w:t xml:space="preserve">hời </w:t>
-      </w:r>
-      <w:r>
-        <w:rPr>
-          <w:color w:val="000000" w:themeColor="text1"/>
-          <w:sz w:val="28"/>
-          <w:szCs w:val="28"/>
-        </w:rPr>
-        <w:t>h</w:t>
-      </w:r>
-      <w:r>
-        <w:rPr>
-          <w:color w:val="000000" w:themeColor="text1"/>
-          <w:sz w:val="28"/>
-          <w:szCs w:val="28"/>
-        </w:rPr>
-        <w:t xml:space="preserve">ạn hoặc </w:t>
-      </w:r>
-      <w:r>
-        <w:rPr>
-          <w:color w:val="000000" w:themeColor="text1"/>
-          <w:sz w:val="28"/>
-          <w:szCs w:val="28"/>
-        </w:rPr>
-        <w:t>t</w:t>
-      </w:r>
-      <w:r>
-        <w:rPr>
-          <w:color w:val="000000" w:themeColor="text1"/>
-          <w:sz w:val="28"/>
-          <w:szCs w:val="28"/>
-        </w:rPr>
-        <w:t xml:space="preserve">hời </w:t>
-      </w:r>
-      <w:r>
-        <w:rPr>
-          <w:color w:val="000000" w:themeColor="text1"/>
-          <w:sz w:val="28"/>
-          <w:szCs w:val="28"/>
-        </w:rPr>
-        <w:t>h</w:t>
-      </w:r>
-      <w:r>
-        <w:rPr>
-          <w:color w:val="000000" w:themeColor="text1"/>
-          <w:sz w:val="28"/>
-          <w:szCs w:val="28"/>
-        </w:rPr>
-        <w:t xml:space="preserve">ạn đã gia hạn liền trước đó. Để cho rõ ràng, trong trường hợp </w:t>
-      </w:r>
-      <w:r>
-        <w:rPr>
-          <w:color w:val="000000" w:themeColor="text1"/>
-          <w:sz w:val="28"/>
-          <w:szCs w:val="28"/>
-        </w:rPr>
-        <w:t>c</w:t>
-      </w:r>
-      <w:r>
-        <w:rPr>
-          <w:color w:val="000000" w:themeColor="text1"/>
-          <w:sz w:val="28"/>
-          <w:szCs w:val="28"/>
-        </w:rPr>
-        <w:t xml:space="preserve">ác </w:t>
-      </w:r>
-      <w:r>
-        <w:rPr>
-          <w:color w:val="000000" w:themeColor="text1"/>
-          <w:sz w:val="28"/>
-          <w:szCs w:val="28"/>
-        </w:rPr>
-        <w:t>b</w:t>
-      </w:r>
-      <w:r>
-        <w:rPr>
-          <w:color w:val="000000" w:themeColor="text1"/>
-          <w:sz w:val="28"/>
-          <w:szCs w:val="28"/>
-        </w:rPr>
-        <w:t xml:space="preserve">ên đã thể hiện rõ ý chí về việc gia hạn </w:t>
-      </w:r>
-      <w:r>
-        <w:rPr>
-          <w:color w:val="000000" w:themeColor="text1"/>
-          <w:sz w:val="28"/>
-          <w:szCs w:val="28"/>
-        </w:rPr>
-        <w:t>t</w:t>
-      </w:r>
-      <w:r>
-        <w:rPr>
-          <w:color w:val="000000" w:themeColor="text1"/>
-          <w:sz w:val="28"/>
-          <w:szCs w:val="28"/>
-        </w:rPr>
-        <w:t xml:space="preserve">hời </w:t>
-      </w:r>
-      <w:r>
-        <w:rPr>
-          <w:color w:val="000000" w:themeColor="text1"/>
-          <w:sz w:val="28"/>
-          <w:szCs w:val="28"/>
-        </w:rPr>
-        <w:t>h</w:t>
-      </w:r>
-      <w:r>
-        <w:rPr>
-          <w:color w:val="000000" w:themeColor="text1"/>
-          <w:sz w:val="28"/>
-          <w:szCs w:val="28"/>
-        </w:rPr>
-        <w:t xml:space="preserve">ạn bằng việc vẫn tiếp tục cung cấp và sử dụng </w:t>
-      </w:r>
-      <w:r>
-        <w:rPr>
-          <w:color w:val="000000" w:themeColor="text1"/>
-          <w:sz w:val="28"/>
-          <w:szCs w:val="28"/>
-        </w:rPr>
-        <w:t>d</w:t>
-      </w:r>
-      <w:r>
-        <w:rPr>
-          <w:color w:val="000000" w:themeColor="text1"/>
-          <w:sz w:val="28"/>
-          <w:szCs w:val="28"/>
-        </w:rPr>
-        <w:t xml:space="preserve">ịch </w:t>
-      </w:r>
-      <w:r>
-        <w:rPr>
-          <w:color w:val="000000" w:themeColor="text1"/>
-          <w:sz w:val="28"/>
-          <w:szCs w:val="28"/>
-        </w:rPr>
-        <w:t>v</w:t>
-      </w:r>
-      <w:r>
-        <w:rPr>
-          <w:color w:val="000000" w:themeColor="text1"/>
-          <w:sz w:val="28"/>
-          <w:szCs w:val="28"/>
-        </w:rPr>
-        <w:t xml:space="preserve">ụ trên thực tế trong thời gian nêu trên nhưng chưa hoàn tất thủ tục ký kết phụ lục về việc gia hạn </w:t>
-      </w:r>
-      <w:r>
-        <w:rPr>
-          <w:color w:val="000000" w:themeColor="text1"/>
-          <w:sz w:val="28"/>
-          <w:szCs w:val="28"/>
-        </w:rPr>
-        <w:t>h</w:t>
-      </w:r>
-      <w:r>
-        <w:rPr>
-          <w:color w:val="000000" w:themeColor="text1"/>
-          <w:sz w:val="28"/>
-          <w:szCs w:val="28"/>
-        </w:rPr>
-        <w:t xml:space="preserve">ợp </w:t>
-      </w:r>
-      <w:r>
-        <w:rPr>
-          <w:color w:val="000000" w:themeColor="text1"/>
-          <w:sz w:val="28"/>
-          <w:szCs w:val="28"/>
-        </w:rPr>
-        <w:t>đ</w:t>
-      </w:r>
-      <w:r>
-        <w:rPr>
-          <w:color w:val="000000" w:themeColor="text1"/>
-          <w:sz w:val="28"/>
-          <w:szCs w:val="28"/>
-        </w:rPr>
-        <w:t xml:space="preserve">ồng thì </w:t>
-      </w:r>
-      <w:r>
-        <w:rPr>
-          <w:color w:val="000000" w:themeColor="text1"/>
-          <w:sz w:val="28"/>
-          <w:szCs w:val="28"/>
-        </w:rPr>
-        <w:t>h</w:t>
-      </w:r>
-      <w:r>
-        <w:rPr>
-          <w:color w:val="000000" w:themeColor="text1"/>
-          <w:sz w:val="28"/>
-          <w:szCs w:val="28"/>
-        </w:rPr>
-        <w:t xml:space="preserve">ợp </w:t>
-      </w:r>
-      <w:r>
-        <w:rPr>
-          <w:color w:val="000000" w:themeColor="text1"/>
-          <w:sz w:val="28"/>
-          <w:szCs w:val="28"/>
-        </w:rPr>
-        <w:t>đ</w:t>
-      </w:r>
-      <w:r>
-        <w:rPr>
-          <w:color w:val="000000" w:themeColor="text1"/>
-          <w:sz w:val="28"/>
-          <w:szCs w:val="28"/>
-        </w:rPr>
-        <w:t xml:space="preserve">ồng được xem là tự động gia hạn cho đến khi </w:t>
+        <w:t xml:space="preserve">tự động gia hạn cho đến khi </w:t>
       </w:r>
       <w:r>
         <w:rPr>
@@ -3420,7 +3396,23 @@
           <w:sz w:val="28"/>
           <w:szCs w:val="28"/>
         </w:rPr>
-        <w:t xml:space="preserve">ồng này mà không khắc phục trong thời hạn …… ngày làm việc kể từ ngày </w:t>
+        <w:t xml:space="preserve">ồng này mà không khắc phục trong thời hạn </w:t>
+      </w:r>
+      <w:r>
+        <w:rPr>
+          <w:color w:val="000000" w:themeColor="text1"/>
+          <w:sz w:val="28"/>
+          <w:szCs w:val="28"/>
+        </w:rPr>
+        <w:t>7</w:t>
+      </w:r>
+      <w:r>
+        <w:rPr>
+          <w:color w:val="000000" w:themeColor="text1"/>
+          <w:sz w:val="28"/>
+          <w:szCs w:val="28"/>
+        </w:rPr>
+        <w:t xml:space="preserve"> ngày làm việc kể từ ngày </w:t>
       </w:r>
       <w:r>
         <w:rPr>
@@ -4095,7 +4087,6 @@
           <w:sz w:val="28"/>
           <w:szCs w:val="28"/>
         </w:rPr>
-        <w:lastRenderedPageBreak/>
         <w:t xml:space="preserve">Trong trường hợp có sự thay đổi về chính sách tiền lương do </w:t>
       </w:r>
       <w:r>
@@ -4457,6 +4448,7 @@
           <w:sz w:val="28"/>
           <w:szCs w:val="28"/>
         </w:rPr>
+        <w:lastRenderedPageBreak/>
         <w:t xml:space="preserve">Hình thức thanh toán: bằng tiền Việt Nam đồng dưới hình thức tiền mặt hoặc chuyển khoản vào số tài khoản nêu tại </w:t>
       </w:r>
       <w:r>
@@ -4664,7 +4656,7 @@
           <w:szCs w:val="28"/>
           <w:vertAlign w:val="superscript"/>
         </w:rPr>
-        <w:footnoteReference w:id="2"/>
+        <w:footnoteReference w:id="1"/>
       </w:r>
       <w:r>
         <w:rPr>
@@ -5385,7 +5377,6 @@
           <w:sz w:val="28"/>
           <w:szCs w:val="28"/>
         </w:rPr>
-        <w:lastRenderedPageBreak/>
         <w:t xml:space="preserve">Thu xếp và đảm bảo </w:t>
       </w:r>
       <w:r>
@@ -5682,6 +5673,7 @@
           <w:sz w:val="28"/>
           <w:szCs w:val="28"/>
         </w:rPr>
+        <w:lastRenderedPageBreak/>
         <w:t xml:space="preserve">Thanh toán các chi phí liên quan đến sửa chữa, bảo trì, thay thế các thiết bị hư hỏng và các chi phí liên quan đến hoạt động vận hành của nhà chung cư ngoài phạm vi </w:t>
       </w:r>
       <w:r>
@@ -6516,7 +6508,6 @@
           <w:sz w:val="28"/>
           <w:szCs w:val="28"/>
         </w:rPr>
-        <w:lastRenderedPageBreak/>
         <w:t xml:space="preserve">Bố trí hoặc thuyên chuyển bất kỳ nhân viên nào đang làm việc cho </w:t>
       </w:r>
       <w:r>
@@ -6897,7 +6888,16 @@
           <w:sz w:val="28"/>
           <w:szCs w:val="28"/>
         </w:rPr>
-        <w:t xml:space="preserve">ý do hành vi cố tình phá hoại và/ hoặc cố tình vi phạm pháp luật và/ hoặc do sử dụng sai công năng, tự ý sửa chữa, lắp đặt thêm, mua mới của </w:t>
+        <w:t xml:space="preserve">ý do hành vi cố </w:t>
+      </w:r>
+      <w:r>
+        <w:rPr>
+          <w:color w:val="000000" w:themeColor="text1"/>
+          <w:sz w:val="28"/>
+          <w:szCs w:val="28"/>
+        </w:rPr>
+        <w:lastRenderedPageBreak/>
+        <w:t xml:space="preserve">tình phá hoại và/ hoặc cố tình vi phạm pháp luật và/ hoặc do sử dụng sai công năng, tự ý sửa chữa, lắp đặt thêm, mua mới của </w:t>
       </w:r>
       <w:r>
         <w:rPr>
@@ -7918,16 +7918,15 @@
           <w:sz w:val="28"/>
           <w:szCs w:val="28"/>
         </w:rPr>
-        <w:lastRenderedPageBreak/>
-        <w:t>Cử nhân viên kỹ thuật để xử lý các sự cố phát sinh/ được thông báo trong thời hạn …. (….)</w:t>
-      </w:r>
-      <w:r>
-        <w:rPr>
-          <w:color w:val="000000" w:themeColor="text1"/>
-          <w:sz w:val="28"/>
-          <w:szCs w:val="28"/>
-        </w:rPr>
-        <w:footnoteReference w:id="3"/>
+        <w:t>Cử nhân viên kỹ thuật để xử lý các sự cố phát sinh/ được thông báo trong thời hạn</w:t>
+      </w:r>
+      <w:r>
+        <w:rPr>
+          <w:color w:val="000000" w:themeColor="text1"/>
+          <w:sz w:val="28"/>
+          <w:szCs w:val="28"/>
+        </w:rPr>
+        <w:footnoteReference w:id="2"/>
       </w:r>
       <w:r>
         <w:rPr>
@@ -8071,7 +8070,16 @@
           <w:sz w:val="28"/>
           <w:szCs w:val="28"/>
         </w:rPr>
-        <w:t>Sau khi ban quản trị nhà chung cư được thành lập, thực hiện thu hộ tiền thù lao và kinh phí hoạt động cho ban quản trị nhà chung cư theo mức mà hội nghị nhà chung cư đã quyết định và bàn giao số tiền thu được sau khi được cung cấp các hồ sơ chứng từ theo quy định pháp luật và/ hoặc quy chế hoạt động của ban quản trị (nếu có);</w:t>
+        <w:t xml:space="preserve">Sau khi ban quản trị nhà chung cư được thành lập, thực hiện thu hộ tiền thù lao và kinh phí hoạt động cho ban quản trị nhà chung cư theo mức mà hội nghị nhà chung cư </w:t>
+      </w:r>
+      <w:r>
+        <w:rPr>
+          <w:color w:val="000000" w:themeColor="text1"/>
+          <w:sz w:val="28"/>
+          <w:szCs w:val="28"/>
+        </w:rPr>
+        <w:lastRenderedPageBreak/>
+        <w:t>đã quyết định và bàn giao số tiền thu được sau khi được cung cấp các hồ sơ chứng từ theo quy định pháp luật và/ hoặc quy chế hoạt động của ban quản trị (nếu có);</w:t>
       </w:r>
     </w:p>
     <w:p>
@@ -8900,7 +8908,6 @@
           <w:sz w:val="28"/>
           <w:szCs w:val="28"/>
         </w:rPr>
-        <w:lastRenderedPageBreak/>
         <w:t xml:space="preserve">Sự Kiện Bất Khả Kháng là tất cả những sự kiện xảy ra một cách khách quan không thể lường trước được và không thể khắc phục được mặc dù đã áp dụng mọi biện pháp cần thiết và khả năng cho phép. Các khó khăn về tài chính đơn thuần dẫn đến việc không thanh toán hoặc không thanh toán đủ </w:t>
       </w:r>
       <w:r>
@@ -9073,7 +9080,16 @@
           <w:sz w:val="28"/>
           <w:szCs w:val="28"/>
         </w:rPr>
-        <w:t xml:space="preserve">ên đó đã áp dụng các biện pháp hợp lý để giảm thiểu sự chậm trễ hay các tổn thất phát sinh và phải thông báo kịp thời về Sự Kiện Bất Khả Kháng cũng như việc không thực hiện hoặc chậm thực hiện nghĩa vụ của mình cho </w:t>
+        <w:t xml:space="preserve">ên đó đã áp dụng các biện pháp hợp lý để </w:t>
+      </w:r>
+      <w:r>
+        <w:rPr>
+          <w:color w:val="000000" w:themeColor="text1"/>
+          <w:sz w:val="28"/>
+          <w:szCs w:val="28"/>
+        </w:rPr>
+        <w:lastRenderedPageBreak/>
+        <w:t xml:space="preserve">giảm thiểu sự chậm trễ hay các tổn thất phát sinh và phải thông báo kịp thời về Sự Kiện Bất Khả Kháng cũng như việc không thực hiện hoặc chậm thực hiện nghĩa vụ của mình cho </w:t>
       </w:r>
       <w:r>
         <w:rPr>
@@ -9501,18 +9517,13 @@
     </w:p>
     <w:p>
       <w:pPr>
-        <w:numPr>
-          <w:ilvl w:val="0"/>
-          <w:numId w:val="7"/>
-        </w:numPr>
-        <w:tabs>
-          <w:tab w:val="left" w:pos="284"/>
-        </w:tabs>
         <w:spacing w:line="360" w:lineRule="auto"/>
-        <w:ind w:left="-284" w:firstLine="208"/>
+        <w:ind w:left="-284"/>
         <w:contextualSpacing/>
         <w:jc w:val="both"/>
         <w:rPr>
+          <w:b/>
+          <w:bCs/>
           <w:color w:val="000000" w:themeColor="text1"/>
           <w:sz w:val="28"/>
           <w:szCs w:val="28"/>
@@ -9781,219 +9792,6 @@
           <w:szCs w:val="28"/>
         </w:rPr>
         <w:t xml:space="preserve">ý. </w:t>
-      </w:r>
-    </w:p>
-    <w:p>
-      <w:pPr>
-        <w:numPr>
-          <w:ilvl w:val="0"/>
-          <w:numId w:val="7"/>
-        </w:numPr>
-        <w:tabs>
-          <w:tab w:val="left" w:pos="284"/>
-        </w:tabs>
-        <w:spacing w:line="360" w:lineRule="auto"/>
-        <w:ind w:left="-284" w:firstLine="208"/>
-        <w:contextualSpacing/>
-        <w:jc w:val="both"/>
-        <w:rPr>
-          <w:color w:val="000000" w:themeColor="text1"/>
-          <w:sz w:val="28"/>
-          <w:szCs w:val="28"/>
-        </w:rPr>
-      </w:pPr>
-      <w:r>
-        <w:rPr>
-          <w:color w:val="000000" w:themeColor="text1"/>
-          <w:sz w:val="28"/>
-          <w:szCs w:val="28"/>
-        </w:rPr>
-        <w:t xml:space="preserve">Bên B được thụ hưởng ….% doanh thu từ việc khai thác, kinh doanh </w:t>
-      </w:r>
-      <w:r>
-        <w:rPr>
-          <w:color w:val="000000" w:themeColor="text1"/>
-          <w:sz w:val="28"/>
-          <w:szCs w:val="28"/>
-        </w:rPr>
-        <w:t>p</w:t>
-      </w:r>
-      <w:r>
-        <w:rPr>
-          <w:color w:val="000000" w:themeColor="text1"/>
-          <w:sz w:val="28"/>
-          <w:szCs w:val="28"/>
-        </w:rPr>
-        <w:t xml:space="preserve">hần </w:t>
-      </w:r>
-      <w:r>
-        <w:rPr>
-          <w:color w:val="000000" w:themeColor="text1"/>
-          <w:sz w:val="28"/>
-          <w:szCs w:val="28"/>
-        </w:rPr>
-        <w:t>c</w:t>
-      </w:r>
-      <w:r>
-        <w:rPr>
-          <w:color w:val="000000" w:themeColor="text1"/>
-          <w:sz w:val="28"/>
-          <w:szCs w:val="28"/>
-        </w:rPr>
-        <w:t xml:space="preserve">hung. Doanh thu từ việc khai thác, kinh doanh </w:t>
-      </w:r>
-      <w:r>
-        <w:rPr>
-          <w:color w:val="000000" w:themeColor="text1"/>
-          <w:sz w:val="28"/>
-          <w:szCs w:val="28"/>
-        </w:rPr>
-        <w:t>p</w:t>
-      </w:r>
-      <w:r>
-        <w:rPr>
-          <w:color w:val="000000" w:themeColor="text1"/>
-          <w:sz w:val="28"/>
-          <w:szCs w:val="28"/>
-        </w:rPr>
-        <w:t xml:space="preserve">hần </w:t>
-      </w:r>
-      <w:r>
-        <w:rPr>
-          <w:color w:val="000000" w:themeColor="text1"/>
-          <w:sz w:val="28"/>
-          <w:szCs w:val="28"/>
-        </w:rPr>
-        <w:t>c</w:t>
-      </w:r>
-      <w:r>
-        <w:rPr>
-          <w:color w:val="000000" w:themeColor="text1"/>
-          <w:sz w:val="28"/>
-          <w:szCs w:val="28"/>
-        </w:rPr>
-        <w:t xml:space="preserve">hung còn lại là …% được sử dụng để </w:t>
-      </w:r>
-      <w:r>
-        <w:rPr>
-          <w:color w:val="000000" w:themeColor="text1"/>
-          <w:sz w:val="28"/>
-          <w:szCs w:val="28"/>
-        </w:rPr>
-        <w:lastRenderedPageBreak/>
-        <w:t xml:space="preserve">phục vụ cho việc quản lý vận hành tại </w:t>
-      </w:r>
-      <w:r>
-        <w:rPr>
-          <w:color w:val="000000" w:themeColor="text1"/>
-          <w:sz w:val="28"/>
-          <w:szCs w:val="28"/>
-        </w:rPr>
-        <w:t>k</w:t>
-      </w:r>
-      <w:r>
-        <w:rPr>
-          <w:color w:val="000000" w:themeColor="text1"/>
-          <w:sz w:val="28"/>
-          <w:szCs w:val="28"/>
-        </w:rPr>
-        <w:t xml:space="preserve">hu </w:t>
-      </w:r>
-      <w:r>
-        <w:rPr>
-          <w:color w:val="000000" w:themeColor="text1"/>
-          <w:sz w:val="28"/>
-          <w:szCs w:val="28"/>
-        </w:rPr>
-        <w:t>v</w:t>
-      </w:r>
-      <w:r>
-        <w:rPr>
-          <w:color w:val="000000" w:themeColor="text1"/>
-          <w:sz w:val="28"/>
-          <w:szCs w:val="28"/>
-        </w:rPr>
-        <w:t xml:space="preserve">ực </w:t>
-      </w:r>
-      <w:r>
-        <w:rPr>
-          <w:color w:val="000000" w:themeColor="text1"/>
-          <w:sz w:val="28"/>
-          <w:szCs w:val="28"/>
-        </w:rPr>
-        <w:t>q</w:t>
-      </w:r>
-      <w:r>
-        <w:rPr>
-          <w:color w:val="000000" w:themeColor="text1"/>
-          <w:sz w:val="28"/>
-          <w:szCs w:val="28"/>
-        </w:rPr>
-        <w:t xml:space="preserve">uản </w:t>
-      </w:r>
-      <w:r>
-        <w:rPr>
-          <w:color w:val="000000" w:themeColor="text1"/>
-          <w:sz w:val="28"/>
-          <w:szCs w:val="28"/>
-        </w:rPr>
-        <w:t>l</w:t>
-      </w:r>
-      <w:r>
-        <w:rPr>
-          <w:color w:val="000000" w:themeColor="text1"/>
-          <w:sz w:val="28"/>
-          <w:szCs w:val="28"/>
-        </w:rPr>
-        <w:t xml:space="preserve">ý, trong trường hợp còn dư thì được kết chuyển và ghi có vào </w:t>
-      </w:r>
-      <w:r>
-        <w:rPr>
-          <w:color w:val="000000" w:themeColor="text1"/>
-          <w:sz w:val="28"/>
-          <w:szCs w:val="28"/>
-        </w:rPr>
-        <w:t>p</w:t>
-      </w:r>
-      <w:r>
-        <w:rPr>
-          <w:color w:val="000000" w:themeColor="text1"/>
-          <w:sz w:val="28"/>
-          <w:szCs w:val="28"/>
-        </w:rPr>
-        <w:t xml:space="preserve">hí </w:t>
-      </w:r>
-      <w:r>
-        <w:rPr>
-          <w:color w:val="000000" w:themeColor="text1"/>
-          <w:sz w:val="28"/>
-          <w:szCs w:val="28"/>
-        </w:rPr>
-        <w:t>q</w:t>
-      </w:r>
-      <w:r>
-        <w:rPr>
-          <w:color w:val="000000" w:themeColor="text1"/>
-          <w:sz w:val="28"/>
-          <w:szCs w:val="28"/>
-        </w:rPr>
-        <w:t xml:space="preserve">uản </w:t>
-      </w:r>
-      <w:r>
-        <w:rPr>
-          <w:color w:val="000000" w:themeColor="text1"/>
-          <w:sz w:val="28"/>
-          <w:szCs w:val="28"/>
-        </w:rPr>
-        <w:t>l</w:t>
-      </w:r>
-      <w:r>
-        <w:rPr>
-          <w:color w:val="000000" w:themeColor="text1"/>
-          <w:sz w:val="28"/>
-          <w:szCs w:val="28"/>
-        </w:rPr>
-        <w:t xml:space="preserve">ý hàng tháng của năm tiếp theo. </w:t>
       </w:r>
     </w:p>
     <w:p>
@@ -10441,7 +10239,16 @@
           <w:sz w:val="28"/>
           <w:szCs w:val="28"/>
         </w:rPr>
-        <w:t xml:space="preserve">ên bị vi phạm toàn bộ các thiệt hại, tổn thất mà </w:t>
+        <w:t xml:space="preserve">ên bị vi </w:t>
+      </w:r>
+      <w:r>
+        <w:rPr>
+          <w:color w:val="000000" w:themeColor="text1"/>
+          <w:sz w:val="28"/>
+          <w:szCs w:val="28"/>
+        </w:rPr>
+        <w:lastRenderedPageBreak/>
+        <w:t xml:space="preserve">phạm toàn bộ các thiệt hại, tổn thất mà </w:t>
       </w:r>
       <w:r>
         <w:rPr>
@@ -11186,7 +10993,7 @@
           <w:szCs w:val="28"/>
           <w:vertAlign w:val="superscript"/>
         </w:rPr>
-        <w:footnoteReference w:id="4"/>
+        <w:footnoteReference w:id="3"/>
       </w:r>
       <w:r>
         <w:rPr>
@@ -11673,7 +11480,7 @@
           <w:szCs w:val="28"/>
           <w:vertAlign w:val="superscript"/>
         </w:rPr>
-        <w:footnoteReference w:id="5"/>
+        <w:footnoteReference w:id="4"/>
       </w:r>
       <w:r>
         <w:rPr>
@@ -12403,7 +12210,7 @@
           <w:tag w:val="text"/>
           <w:id w:val="1046799179"/>
           <w:placeholder>
-            <w:docPart w:val="DefaultPlaceholder_-1854013440"/>
+            <w:docPart w:val="D0EF9DEE983D4D66897563C46B51C474"/>
           </w:placeholder>
           <w:showingPlcHdr/>
           <w:text/>
@@ -12853,7 +12660,7 @@
           <w:szCs w:val="28"/>
           <w:vertAlign w:val="superscript"/>
         </w:rPr>
-        <w:footnoteReference w:id="6"/>
+        <w:footnoteReference w:id="5"/>
       </w:r>
       <w:r>
         <w:rPr>
@@ -12975,7 +12782,7 @@
             <w:tag w:val="text"/>
             <w:id w:val="-1829274197"/>
             <w:placeholder>
-              <w:docPart w:val="DefaultPlaceholder_-1854013440"/>
+              <w:docPart w:val="D63B9B9749BF4CF48F1D4D6156B4DD00"/>
             </w:placeholder>
             <w:showingPlcHdr/>
             <w:text/>
@@ -13544,7 +13351,7 @@
           <w:sz w:val="20"/>
           <w:szCs w:val="20"/>
         </w:rPr>
-        <w:t xml:space="preserve"> Các Bên điền đầy đủ phần còn trống trong Hợp Đồng này theo thỏa thuận và không trái với quy định của pháp luật.</w:t>
+        <w:t xml:space="preserve"> Các Bên có thể điều chỉnh theo thỏa thuận nhưng không được vượt quá 20%/năm.</w:t>
       </w:r>
     </w:p>
   </w:footnote>
@@ -13577,11 +13384,43 @@
           <w:sz w:val="20"/>
           <w:szCs w:val="20"/>
         </w:rPr>
-        <w:t xml:space="preserve"> Các Bên có thể điều chỉnh theo thỏa thuận nhưng không được vượt quá 20%/năm.</w:t>
+        <w:t xml:space="preserve"> Điền theo thỏa thuận của Các Bên</w:t>
       </w:r>
     </w:p>
   </w:footnote>
   <w:footnote w:id="3">
+    <w:p>
+      <w:pPr>
+        <w:pBdr>
+          <w:top w:val="nil"/>
+          <w:left w:val="nil"/>
+          <w:bottom w:val="nil"/>
+          <w:right w:val="nil"/>
+          <w:between w:val="nil"/>
+        </w:pBdr>
+        <w:rPr>
+          <w:color w:val="000000"/>
+          <w:sz w:val="20"/>
+          <w:szCs w:val="20"/>
+        </w:rPr>
+      </w:pPr>
+      <w:r>
+        <w:rPr>
+          <w:rStyle w:val="FootnoteReference"/>
+        </w:rPr>
+        <w:footnoteRef/>
+      </w:r>
+      <w:r>
+        <w:rPr>
+          <w:color w:val="000000"/>
+          <w:sz w:val="20"/>
+          <w:szCs w:val="20"/>
+        </w:rPr>
+        <w:t xml:space="preserve"> Điền theo thỏa thuận của Các Bên, tối đa 1.000.000 VNĐ.</w:t>
+      </w:r>
+    </w:p>
+  </w:footnote>
+  <w:footnote w:id="4">
     <w:p>
       <w:pPr>
         <w:pBdr>
@@ -13594,8 +13433,6 @@
         <w:jc w:val="both"/>
         <w:rPr>
           <w:color w:val="000000"/>
-          <w:sz w:val="20"/>
-          <w:szCs w:val="20"/>
         </w:rPr>
       </w:pPr>
       <w:r>
@@ -13610,74 +13447,11 @@
           <w:sz w:val="20"/>
           <w:szCs w:val="20"/>
         </w:rPr>
-        <w:t xml:space="preserve"> Điền theo thỏa thuận của Các Bên</w:t>
-      </w:r>
-    </w:p>
-  </w:footnote>
-  <w:footnote w:id="4">
-    <w:p>
-      <w:pPr>
-        <w:pBdr>
-          <w:top w:val="nil"/>
-          <w:left w:val="nil"/>
-          <w:bottom w:val="nil"/>
-          <w:right w:val="nil"/>
-          <w:between w:val="nil"/>
-        </w:pBdr>
-        <w:rPr>
-          <w:color w:val="000000"/>
-          <w:sz w:val="20"/>
-          <w:szCs w:val="20"/>
-        </w:rPr>
-      </w:pPr>
-      <w:r>
-        <w:rPr>
-          <w:rStyle w:val="FootnoteReference"/>
-        </w:rPr>
-        <w:footnoteRef/>
-      </w:r>
-      <w:r>
-        <w:rPr>
-          <w:color w:val="000000"/>
-          <w:sz w:val="20"/>
-          <w:szCs w:val="20"/>
-        </w:rPr>
-        <w:t xml:space="preserve"> Điền theo thỏa thuận của Các Bên, tối đa 1.000.000 VNĐ.</w:t>
+        <w:t xml:space="preserve"> Các nội dung để trống được điền theo thỏa thuận của Các Bên.</w:t>
       </w:r>
     </w:p>
   </w:footnote>
   <w:footnote w:id="5">
-    <w:p>
-      <w:pPr>
-        <w:pBdr>
-          <w:top w:val="nil"/>
-          <w:left w:val="nil"/>
-          <w:bottom w:val="nil"/>
-          <w:right w:val="nil"/>
-          <w:between w:val="nil"/>
-        </w:pBdr>
-        <w:jc w:val="both"/>
-        <w:rPr>
-          <w:color w:val="000000"/>
-        </w:rPr>
-      </w:pPr>
-      <w:r>
-        <w:rPr>
-          <w:rStyle w:val="FootnoteReference"/>
-        </w:rPr>
-        <w:footnoteRef/>
-      </w:r>
-      <w:r>
-        <w:rPr>
-          <w:color w:val="000000"/>
-          <w:sz w:val="20"/>
-          <w:szCs w:val="20"/>
-        </w:rPr>
-        <w:t xml:space="preserve"> Các nội dung để trống được điền theo thỏa thuận của Các Bên.</w:t>
-      </w:r>
-    </w:p>
-  </w:footnote>
-  <w:footnote w:id="6">
     <w:p>
       <w:pPr>
         <w:pBdr>
@@ -17828,11 +17602,14 @@
       <w:docPartBody>
         <w:p>
           <w:pPr>
-            <w:pStyle w:val="DCB770D8885E47D2A063729CC2A38920"/>
+            <w:pStyle w:val="DCB770D8885E47D2A063729CC2A389201"/>
           </w:pPr>
           <w:r>
             <w:rPr>
               <w:rStyle w:val="PlaceholderText"/>
+              <w:color w:val="000000" w:themeColor="text1"/>
+              <w:sz w:val="28"/>
+              <w:szCs w:val="28"/>
             </w:rPr>
             <w:t>Click or tap here to enter text.</w:t>
           </w:r>
@@ -17857,11 +17634,14 @@
       <w:docPartBody>
         <w:p>
           <w:pPr>
-            <w:pStyle w:val="EF4CB8A3D9674B918225F02547239B32"/>
+            <w:pStyle w:val="EF4CB8A3D9674B918225F02547239B321"/>
           </w:pPr>
           <w:r>
             <w:rPr>
               <w:rStyle w:val="PlaceholderText"/>
+              <w:color w:val="000000" w:themeColor="text1"/>
+              <w:sz w:val="28"/>
+              <w:szCs w:val="28"/>
             </w:rPr>
             <w:t>Click or tap here to enter text.</w:t>
           </w:r>
@@ -17886,11 +17666,14 @@
       <w:docPartBody>
         <w:p>
           <w:pPr>
-            <w:pStyle w:val="C888AFF43987433AA8133674F06848FB"/>
+            <w:pStyle w:val="C888AFF43987433AA8133674F06848FB1"/>
           </w:pPr>
           <w:r>
             <w:rPr>
               <w:rStyle w:val="PlaceholderText"/>
+              <w:color w:val="000000" w:themeColor="text1"/>
+              <w:sz w:val="28"/>
+              <w:szCs w:val="28"/>
             </w:rPr>
             <w:t>Click or tap here to enter text.</w:t>
           </w:r>
@@ -17915,11 +17698,14 @@
       <w:docPartBody>
         <w:p>
           <w:pPr>
-            <w:pStyle w:val="9CE26EF61CAB45FBBFFCDC2173C47B11"/>
+            <w:pStyle w:val="9CE26EF61CAB45FBBFFCDC2173C47B111"/>
           </w:pPr>
           <w:r>
             <w:rPr>
               <w:rStyle w:val="PlaceholderText"/>
+              <w:color w:val="000000" w:themeColor="text1"/>
+              <w:sz w:val="28"/>
+              <w:szCs w:val="28"/>
             </w:rPr>
             <w:t>Click or tap here to enter text.</w:t>
           </w:r>
@@ -17944,11 +17730,14 @@
       <w:docPartBody>
         <w:p>
           <w:pPr>
-            <w:pStyle w:val="28DD5B7498BC493F8F1AB6C5FA151EBF"/>
+            <w:pStyle w:val="28DD5B7498BC493F8F1AB6C5FA151EBF1"/>
           </w:pPr>
           <w:r>
             <w:rPr>
               <w:rStyle w:val="PlaceholderText"/>
+              <w:color w:val="000000" w:themeColor="text1"/>
+              <w:sz w:val="28"/>
+              <w:szCs w:val="28"/>
             </w:rPr>
             <w:t>Click or tap here to enter text.</w:t>
           </w:r>
@@ -17973,11 +17762,14 @@
       <w:docPartBody>
         <w:p>
           <w:pPr>
-            <w:pStyle w:val="F0FA47C242A8430F9DB02E5DB1CDBE0C"/>
+            <w:pStyle w:val="F0FA47C242A8430F9DB02E5DB1CDBE0C1"/>
           </w:pPr>
           <w:r>
             <w:rPr>
               <w:rStyle w:val="PlaceholderText"/>
+              <w:color w:val="000000" w:themeColor="text1"/>
+              <w:sz w:val="28"/>
+              <w:szCs w:val="28"/>
             </w:rPr>
             <w:t>Click or tap here to enter text.</w:t>
           </w:r>
@@ -18002,11 +17794,14 @@
       <w:docPartBody>
         <w:p>
           <w:pPr>
-            <w:pStyle w:val="DAC0D35971304C878DD511075D23D571"/>
+            <w:pStyle w:val="DAC0D35971304C878DD511075D23D5711"/>
           </w:pPr>
           <w:r>
             <w:rPr>
               <w:rStyle w:val="PlaceholderText"/>
+              <w:color w:val="000000" w:themeColor="text1"/>
+              <w:sz w:val="28"/>
+              <w:szCs w:val="28"/>
             </w:rPr>
             <w:t>Click or tap here to enter text.</w:t>
           </w:r>
@@ -18031,11 +17826,14 @@
       <w:docPartBody>
         <w:p>
           <w:pPr>
-            <w:pStyle w:val="9C23D7270A804D1B80099A6E6F865801"/>
+            <w:pStyle w:val="9C23D7270A804D1B80099A6E6F8658011"/>
           </w:pPr>
           <w:r>
             <w:rPr>
               <w:rStyle w:val="PlaceholderText"/>
+              <w:color w:val="000000" w:themeColor="text1"/>
+              <w:sz w:val="28"/>
+              <w:szCs w:val="28"/>
             </w:rPr>
             <w:t>Click or tap here to enter text.</w:t>
           </w:r>
@@ -18060,11 +17858,14 @@
       <w:docPartBody>
         <w:p>
           <w:pPr>
-            <w:pStyle w:val="771AF8643BC4424492B3CE8C6CE84FFC"/>
+            <w:pStyle w:val="771AF8643BC4424492B3CE8C6CE84FFC1"/>
           </w:pPr>
           <w:r>
             <w:rPr>
               <w:rStyle w:val="PlaceholderText"/>
+              <w:color w:val="000000" w:themeColor="text1"/>
+              <w:sz w:val="28"/>
+              <w:szCs w:val="28"/>
             </w:rPr>
             <w:t>Click or tap here to enter text.</w:t>
           </w:r>
@@ -18089,11 +17890,14 @@
       <w:docPartBody>
         <w:p>
           <w:pPr>
-            <w:pStyle w:val="037B2E864BC04D6FAF471D02A56BF9BA"/>
+            <w:pStyle w:val="037B2E864BC04D6FAF471D02A56BF9BA1"/>
           </w:pPr>
           <w:r>
             <w:rPr>
               <w:rStyle w:val="PlaceholderText"/>
+              <w:color w:val="000000" w:themeColor="text1"/>
+              <w:sz w:val="28"/>
+              <w:szCs w:val="28"/>
             </w:rPr>
             <w:t>Click or tap here to enter text.</w:t>
           </w:r>
@@ -18118,11 +17922,14 @@
       <w:docPartBody>
         <w:p>
           <w:pPr>
-            <w:pStyle w:val="6C1AE95BE4604657A311845165DD5A7E"/>
+            <w:pStyle w:val="6C1AE95BE4604657A311845165DD5A7E1"/>
           </w:pPr>
           <w:r>
             <w:rPr>
               <w:rStyle w:val="PlaceholderText"/>
+              <w:color w:val="000000" w:themeColor="text1"/>
+              <w:sz w:val="28"/>
+              <w:szCs w:val="28"/>
             </w:rPr>
             <w:t>Click or tap here to enter text.</w:t>
           </w:r>
@@ -18147,11 +17954,14 @@
       <w:docPartBody>
         <w:p>
           <w:pPr>
-            <w:pStyle w:val="9622CFAE674D4035981766CBD6CECA60"/>
+            <w:pStyle w:val="9622CFAE674D4035981766CBD6CECA601"/>
           </w:pPr>
           <w:r>
             <w:rPr>
               <w:rStyle w:val="PlaceholderText"/>
+              <w:color w:val="000000" w:themeColor="text1"/>
+              <w:sz w:val="28"/>
+              <w:szCs w:val="28"/>
             </w:rPr>
             <w:t>Click or tap here to enter text.</w:t>
           </w:r>
@@ -18176,11 +17986,14 @@
       <w:docPartBody>
         <w:p>
           <w:pPr>
-            <w:pStyle w:val="0CC4DC1991D94863B8F7B911DA2CBF18"/>
+            <w:pStyle w:val="0CC4DC1991D94863B8F7B911DA2CBF181"/>
           </w:pPr>
           <w:r>
             <w:rPr>
               <w:rStyle w:val="PlaceholderText"/>
+              <w:color w:val="000000" w:themeColor="text1"/>
+              <w:sz w:val="28"/>
+              <w:szCs w:val="28"/>
             </w:rPr>
             <w:t>Click or tap here to enter text.</w:t>
           </w:r>
@@ -18205,11 +18018,14 @@
       <w:docPartBody>
         <w:p>
           <w:pPr>
-            <w:pStyle w:val="D4FC99FBB63D4206AC435DDD9218411F"/>
+            <w:pStyle w:val="D4FC99FBB63D4206AC435DDD9218411F1"/>
           </w:pPr>
           <w:r>
             <w:rPr>
               <w:rStyle w:val="PlaceholderText"/>
+              <w:color w:val="000000" w:themeColor="text1"/>
+              <w:sz w:val="28"/>
+              <w:szCs w:val="28"/>
             </w:rPr>
             <w:t>Click or tap here to enter text.</w:t>
           </w:r>
@@ -18234,11 +18050,14 @@
       <w:docPartBody>
         <w:p>
           <w:pPr>
-            <w:pStyle w:val="87E0A4C4825D4399A8DF77A49BB4C6B8"/>
+            <w:pStyle w:val="87E0A4C4825D4399A8DF77A49BB4C6B81"/>
           </w:pPr>
           <w:r>
             <w:rPr>
               <w:rStyle w:val="PlaceholderText"/>
+              <w:color w:val="000000" w:themeColor="text1"/>
+              <w:sz w:val="28"/>
+              <w:szCs w:val="28"/>
             </w:rPr>
             <w:t>Click or tap here to enter text.</w:t>
           </w:r>
@@ -18263,11 +18082,14 @@
       <w:docPartBody>
         <w:p>
           <w:pPr>
-            <w:pStyle w:val="29358427A07F4C149139741D077299F9"/>
+            <w:pStyle w:val="29358427A07F4C149139741D077299F91"/>
           </w:pPr>
           <w:r>
             <w:rPr>
               <w:rStyle w:val="PlaceholderText"/>
+              <w:color w:val="000000" w:themeColor="text1"/>
+              <w:sz w:val="28"/>
+              <w:szCs w:val="28"/>
             </w:rPr>
             <w:t>Click or tap here to enter text.</w:t>
           </w:r>
@@ -18292,11 +18114,14 @@
       <w:docPartBody>
         <w:p>
           <w:pPr>
-            <w:pStyle w:val="FDD1282F24FC4B829AC0ABA83AB22B19"/>
+            <w:pStyle w:val="FDD1282F24FC4B829AC0ABA83AB22B191"/>
           </w:pPr>
           <w:r>
             <w:rPr>
               <w:rStyle w:val="PlaceholderText"/>
+              <w:color w:val="000000" w:themeColor="text1"/>
+              <w:sz w:val="28"/>
+              <w:szCs w:val="28"/>
             </w:rPr>
             <w:t>Click or tap here to enter text.</w:t>
           </w:r>
@@ -18321,11 +18146,302 @@
       <w:docPartBody>
         <w:p>
           <w:pPr>
-            <w:pStyle w:val="C99A9A77E8F7443585B2DC69DC3F7AAA"/>
+            <w:pStyle w:val="C99A9A77E8F7443585B2DC69DC3F7AAA1"/>
           </w:pPr>
           <w:r>
             <w:rPr>
               <w:rStyle w:val="PlaceholderText"/>
+              <w:color w:val="000000" w:themeColor="text1"/>
+              <w:sz w:val="28"/>
+              <w:szCs w:val="28"/>
+            </w:rPr>
+            <w:t>Click or tap here to enter text.</w:t>
+          </w:r>
+        </w:p>
+      </w:docPartBody>
+    </w:docPart>
+    <w:docPart>
+      <w:docPartPr>
+        <w:name w:val="67BEB2BE146445A8AD3A1B3DF91E9594"/>
+        <w:category>
+          <w:name w:val="General"/>
+          <w:gallery w:val="placeholder"/>
+        </w:category>
+        <w:types>
+          <w:type w:val="bbPlcHdr"/>
+        </w:types>
+        <w:behaviors>
+          <w:behavior w:val="content"/>
+        </w:behaviors>
+        <w:guid w:val="{122D82BC-CA47-4764-A77C-1074ABF6B773}"/>
+      </w:docPartPr>
+      <w:docPartBody>
+        <w:p>
+          <w:pPr>
+            <w:pStyle w:val="67BEB2BE146445A8AD3A1B3DF91E9594"/>
+          </w:pPr>
+          <w:r>
+            <w:rPr>
+              <w:rStyle w:val="PlaceholderText"/>
+              <w:color w:val="000000" w:themeColor="text1"/>
+              <w:sz w:val="28"/>
+              <w:szCs w:val="28"/>
+            </w:rPr>
+            <w:t>Click or tap here to enter text.</w:t>
+          </w:r>
+        </w:p>
+      </w:docPartBody>
+    </w:docPart>
+    <w:docPart>
+      <w:docPartPr>
+        <w:name w:val="13FA158C0F1449999A71E60AA9DD28F0"/>
+        <w:category>
+          <w:name w:val="General"/>
+          <w:gallery w:val="placeholder"/>
+        </w:category>
+        <w:types>
+          <w:type w:val="bbPlcHdr"/>
+        </w:types>
+        <w:behaviors>
+          <w:behavior w:val="content"/>
+        </w:behaviors>
+        <w:guid w:val="{609C83A0-C07E-422C-B81C-486523D3E23F}"/>
+      </w:docPartPr>
+      <w:docPartBody>
+        <w:p>
+          <w:pPr>
+            <w:pStyle w:val="13FA158C0F1449999A71E60AA9DD28F0"/>
+          </w:pPr>
+          <w:r>
+            <w:rPr>
+              <w:rStyle w:val="PlaceholderText"/>
+              <w:color w:val="000000" w:themeColor="text1"/>
+              <w:sz w:val="28"/>
+              <w:szCs w:val="28"/>
+            </w:rPr>
+            <w:t>Click or tap here to enter text.</w:t>
+          </w:r>
+        </w:p>
+      </w:docPartBody>
+    </w:docPart>
+    <w:docPart>
+      <w:docPartPr>
+        <w:name w:val="82EF2F2C29E842F1A15AE3E7C2EA61B6"/>
+        <w:category>
+          <w:name w:val="General"/>
+          <w:gallery w:val="placeholder"/>
+        </w:category>
+        <w:types>
+          <w:type w:val="bbPlcHdr"/>
+        </w:types>
+        <w:behaviors>
+          <w:behavior w:val="content"/>
+        </w:behaviors>
+        <w:guid w:val="{CE89EB78-2B8C-42CE-9D6D-03B081E48AFB}"/>
+      </w:docPartPr>
+      <w:docPartBody>
+        <w:p>
+          <w:pPr>
+            <w:pStyle w:val="82EF2F2C29E842F1A15AE3E7C2EA61B6"/>
+          </w:pPr>
+          <w:r>
+            <w:rPr>
+              <w:rStyle w:val="PlaceholderText"/>
+              <w:color w:val="000000" w:themeColor="text1"/>
+              <w:sz w:val="28"/>
+              <w:szCs w:val="28"/>
+            </w:rPr>
+            <w:t>Click or tap here to enter text.</w:t>
+          </w:r>
+        </w:p>
+      </w:docPartBody>
+    </w:docPart>
+    <w:docPart>
+      <w:docPartPr>
+        <w:name w:val="83AD6591847540EC883D4AB5CE7773EA"/>
+        <w:category>
+          <w:name w:val="General"/>
+          <w:gallery w:val="placeholder"/>
+        </w:category>
+        <w:types>
+          <w:type w:val="bbPlcHdr"/>
+        </w:types>
+        <w:behaviors>
+          <w:behavior w:val="content"/>
+        </w:behaviors>
+        <w:guid w:val="{9810FD9D-ACF3-4CC3-ADB4-873CE6B9AF8D}"/>
+      </w:docPartPr>
+      <w:docPartBody>
+        <w:p>
+          <w:pPr>
+            <w:pStyle w:val="83AD6591847540EC883D4AB5CE7773EA"/>
+          </w:pPr>
+          <w:r>
+            <w:rPr>
+              <w:rStyle w:val="PlaceholderText"/>
+              <w:color w:val="000000" w:themeColor="text1"/>
+              <w:sz w:val="28"/>
+              <w:szCs w:val="28"/>
+            </w:rPr>
+            <w:t>Click or tap here to enter text.</w:t>
+          </w:r>
+        </w:p>
+      </w:docPartBody>
+    </w:docPart>
+    <w:docPart>
+      <w:docPartPr>
+        <w:name w:val="4D5F5C4C105A45658A7D021FC10D15CB"/>
+        <w:category>
+          <w:name w:val="General"/>
+          <w:gallery w:val="placeholder"/>
+        </w:category>
+        <w:types>
+          <w:type w:val="bbPlcHdr"/>
+        </w:types>
+        <w:behaviors>
+          <w:behavior w:val="content"/>
+        </w:behaviors>
+        <w:guid w:val="{0A7D167D-4F71-4E52-85F5-01DC52BB83B4}"/>
+      </w:docPartPr>
+      <w:docPartBody>
+        <w:p>
+          <w:pPr>
+            <w:pStyle w:val="4D5F5C4C105A45658A7D021FC10D15CB"/>
+          </w:pPr>
+          <w:r>
+            <w:rPr>
+              <w:rStyle w:val="PlaceholderText"/>
+              <w:color w:val="000000" w:themeColor="text1"/>
+              <w:sz w:val="28"/>
+              <w:szCs w:val="28"/>
+            </w:rPr>
+            <w:t>Click or tap here to enter text.</w:t>
+          </w:r>
+        </w:p>
+      </w:docPartBody>
+    </w:docPart>
+    <w:docPart>
+      <w:docPartPr>
+        <w:name w:val="77F12E82CE194D8D8A3A84854B22C223"/>
+        <w:category>
+          <w:name w:val="General"/>
+          <w:gallery w:val="placeholder"/>
+        </w:category>
+        <w:types>
+          <w:type w:val="bbPlcHdr"/>
+        </w:types>
+        <w:behaviors>
+          <w:behavior w:val="content"/>
+        </w:behaviors>
+        <w:guid w:val="{EC545F3B-2991-4849-B5C2-6F10EEA15164}"/>
+      </w:docPartPr>
+      <w:docPartBody>
+        <w:p>
+          <w:pPr>
+            <w:pStyle w:val="77F12E82CE194D8D8A3A84854B22C223"/>
+          </w:pPr>
+          <w:r>
+            <w:rPr>
+              <w:rStyle w:val="PlaceholderText"/>
+              <w:color w:val="000000" w:themeColor="text1"/>
+              <w:sz w:val="28"/>
+              <w:szCs w:val="28"/>
+            </w:rPr>
+            <w:t>Click or tap here to enter text.</w:t>
+          </w:r>
+        </w:p>
+      </w:docPartBody>
+    </w:docPart>
+    <w:docPart>
+      <w:docPartPr>
+        <w:name w:val="24BC14EA41F84EDCAF7BE3CECE1AE261"/>
+        <w:category>
+          <w:name w:val="General"/>
+          <w:gallery w:val="placeholder"/>
+        </w:category>
+        <w:types>
+          <w:type w:val="bbPlcHdr"/>
+        </w:types>
+        <w:behaviors>
+          <w:behavior w:val="content"/>
+        </w:behaviors>
+        <w:guid w:val="{4D118ABD-B657-46B9-8FF0-BEC9D81A8DB0}"/>
+      </w:docPartPr>
+      <w:docPartBody>
+        <w:p>
+          <w:pPr>
+            <w:pStyle w:val="24BC14EA41F84EDCAF7BE3CECE1AE261"/>
+          </w:pPr>
+          <w:r>
+            <w:rPr>
+              <w:rStyle w:val="PlaceholderText"/>
+              <w:color w:val="000000" w:themeColor="text1"/>
+              <w:sz w:val="28"/>
+              <w:szCs w:val="28"/>
+            </w:rPr>
+            <w:t>Click or tap here to enter text.</w:t>
+          </w:r>
+        </w:p>
+      </w:docPartBody>
+    </w:docPart>
+    <w:docPart>
+      <w:docPartPr>
+        <w:name w:val="D0EF9DEE983D4D66897563C46B51C474"/>
+        <w:category>
+          <w:name w:val="General"/>
+          <w:gallery w:val="placeholder"/>
+        </w:category>
+        <w:types>
+          <w:type w:val="bbPlcHdr"/>
+        </w:types>
+        <w:behaviors>
+          <w:behavior w:val="content"/>
+        </w:behaviors>
+        <w:guid w:val="{375DFBA1-200D-4427-BB16-460E6F6E6675}"/>
+      </w:docPartPr>
+      <w:docPartBody>
+        <w:p>
+          <w:pPr>
+            <w:pStyle w:val="D0EF9DEE983D4D66897563C46B51C474"/>
+          </w:pPr>
+          <w:r>
+            <w:rPr>
+              <w:rStyle w:val="PlaceholderText"/>
+              <w:color w:val="000000" w:themeColor="text1"/>
+              <w:sz w:val="28"/>
+              <w:szCs w:val="28"/>
+            </w:rPr>
+            <w:t>Click or tap here to enter text.</w:t>
+          </w:r>
+        </w:p>
+      </w:docPartBody>
+    </w:docPart>
+    <w:docPart>
+      <w:docPartPr>
+        <w:name w:val="D63B9B9749BF4CF48F1D4D6156B4DD00"/>
+        <w:category>
+          <w:name w:val="General"/>
+          <w:gallery w:val="placeholder"/>
+        </w:category>
+        <w:types>
+          <w:type w:val="bbPlcHdr"/>
+        </w:types>
+        <w:behaviors>
+          <w:behavior w:val="content"/>
+        </w:behaviors>
+        <w:guid w:val="{85210E3E-6263-47BA-A19E-0D608ED2679B}"/>
+      </w:docPartPr>
+      <w:docPartBody>
+        <w:p>
+          <w:pPr>
+            <w:pStyle w:val="D63B9B9749BF4CF48F1D4D6156B4DD00"/>
+          </w:pPr>
+          <w:r>
+            <w:rPr>
+              <w:rStyle w:val="PlaceholderText"/>
+              <w:color w:val="000000" w:themeColor="text1"/>
+              <w:sz w:val="28"/>
+              <w:szCs w:val="28"/>
             </w:rPr>
             <w:t>Click or tap here to enter text.</w:t>
           </w:r>
@@ -18429,7 +18545,10 @@
     <w:rsid w:val="00A20BD7"/>
     <w:rsid w:val="00AF5A7C"/>
     <w:rsid w:val="00C516ED"/>
+    <w:rsid w:val="00D06718"/>
+    <w:rsid w:val="00E13A98"/>
     <w:rsid w:val="00F17ACF"/>
+    <w:rsid w:val="00FD7554"/>
     <w:rsid w:val="00FF5930"/>
   </w:rsids>
   <m:mathPr>
@@ -18886,82 +19005,334 @@
     <w:basedOn w:val="DefaultParagraphFont"/>
     <w:uiPriority w:val="99"/>
     <w:semiHidden/>
-    <w:rsid w:val="002175C6"/>
+    <w:rsid w:val="00E13A98"/>
     <w:rPr>
       <w:color w:val="666666"/>
     </w:rPr>
   </w:style>
-  <w:style w:type="paragraph" w:customStyle="1" w:styleId="DCB770D8885E47D2A063729CC2A38920">
-    <w:name w:val="DCB770D8885E47D2A063729CC2A38920"/>
-    <w:rsid w:val="008F6352"/>
+  <w:style w:type="paragraph" w:customStyle="1" w:styleId="67BEB2BE146445A8AD3A1B3DF91E9594">
+    <w:name w:val="67BEB2BE146445A8AD3A1B3DF91E9594"/>
+    <w:rsid w:val="00E13A98"/>
+    <w:pPr>
+      <w:spacing w:after="0" w:line="240" w:lineRule="auto"/>
+    </w:pPr>
+    <w:rPr>
+      <w:rFonts w:ascii="Times New Roman" w:eastAsia="Times New Roman" w:hAnsi="Times New Roman" w:cs="Times New Roman"/>
+      <w:kern w:val="0"/>
+      <w14:ligatures w14:val="none"/>
+    </w:rPr>
   </w:style>
-  <w:style w:type="paragraph" w:customStyle="1" w:styleId="EF4CB8A3D9674B918225F02547239B32">
-    <w:name w:val="EF4CB8A3D9674B918225F02547239B32"/>
-    <w:rsid w:val="008F6352"/>
+  <w:style w:type="paragraph" w:customStyle="1" w:styleId="13FA158C0F1449999A71E60AA9DD28F0">
+    <w:name w:val="13FA158C0F1449999A71E60AA9DD28F0"/>
+    <w:rsid w:val="00E13A98"/>
+    <w:pPr>
+      <w:spacing w:after="0" w:line="240" w:lineRule="auto"/>
+    </w:pPr>
+    <w:rPr>
+      <w:rFonts w:ascii="Times New Roman" w:eastAsia="Times New Roman" w:hAnsi="Times New Roman" w:cs="Times New Roman"/>
+      <w:kern w:val="0"/>
+      <w14:ligatures w14:val="none"/>
+    </w:rPr>
   </w:style>
-  <w:style w:type="paragraph" w:customStyle="1" w:styleId="C888AFF43987433AA8133674F06848FB">
-    <w:name w:val="C888AFF43987433AA8133674F06848FB"/>
-    <w:rsid w:val="008F6352"/>
+  <w:style w:type="paragraph" w:customStyle="1" w:styleId="82EF2F2C29E842F1A15AE3E7C2EA61B6">
+    <w:name w:val="82EF2F2C29E842F1A15AE3E7C2EA61B6"/>
+    <w:rsid w:val="00E13A98"/>
+    <w:pPr>
+      <w:spacing w:after="0" w:line="240" w:lineRule="auto"/>
+    </w:pPr>
+    <w:rPr>
+      <w:rFonts w:ascii="Times New Roman" w:eastAsia="Times New Roman" w:hAnsi="Times New Roman" w:cs="Times New Roman"/>
+      <w:kern w:val="0"/>
+      <w14:ligatures w14:val="none"/>
+    </w:rPr>
   </w:style>
-  <w:style w:type="paragraph" w:customStyle="1" w:styleId="9CE26EF61CAB45FBBFFCDC2173C47B11">
-    <w:name w:val="9CE26EF61CAB45FBBFFCDC2173C47B11"/>
-    <w:rsid w:val="008F6352"/>
+  <w:style w:type="paragraph" w:customStyle="1" w:styleId="DCB770D8885E47D2A063729CC2A389201">
+    <w:name w:val="DCB770D8885E47D2A063729CC2A389201"/>
+    <w:rsid w:val="00E13A98"/>
+    <w:pPr>
+      <w:spacing w:after="0" w:line="240" w:lineRule="auto"/>
+    </w:pPr>
+    <w:rPr>
+      <w:rFonts w:ascii="Times New Roman" w:eastAsia="Times New Roman" w:hAnsi="Times New Roman" w:cs="Times New Roman"/>
+      <w:kern w:val="0"/>
+      <w14:ligatures w14:val="none"/>
+    </w:rPr>
   </w:style>
-  <w:style w:type="paragraph" w:customStyle="1" w:styleId="28DD5B7498BC493F8F1AB6C5FA151EBF">
-    <w:name w:val="28DD5B7498BC493F8F1AB6C5FA151EBF"/>
-    <w:rsid w:val="008F6352"/>
+  <w:style w:type="paragraph" w:customStyle="1" w:styleId="EF4CB8A3D9674B918225F02547239B321">
+    <w:name w:val="EF4CB8A3D9674B918225F02547239B321"/>
+    <w:rsid w:val="00E13A98"/>
+    <w:pPr>
+      <w:spacing w:after="0" w:line="240" w:lineRule="auto"/>
+    </w:pPr>
+    <w:rPr>
+      <w:rFonts w:ascii="Times New Roman" w:eastAsia="Times New Roman" w:hAnsi="Times New Roman" w:cs="Times New Roman"/>
+      <w:kern w:val="0"/>
+      <w14:ligatures w14:val="none"/>
+    </w:rPr>
   </w:style>
-  <w:style w:type="paragraph" w:customStyle="1" w:styleId="F0FA47C242A8430F9DB02E5DB1CDBE0C">
-    <w:name w:val="F0FA47C242A8430F9DB02E5DB1CDBE0C"/>
-    <w:rsid w:val="008F6352"/>
+  <w:style w:type="paragraph" w:customStyle="1" w:styleId="C888AFF43987433AA8133674F06848FB1">
+    <w:name w:val="C888AFF43987433AA8133674F06848FB1"/>
+    <w:rsid w:val="00E13A98"/>
+    <w:pPr>
+      <w:spacing w:after="0" w:line="240" w:lineRule="auto"/>
+    </w:pPr>
+    <w:rPr>
+      <w:rFonts w:ascii="Times New Roman" w:eastAsia="Times New Roman" w:hAnsi="Times New Roman" w:cs="Times New Roman"/>
+      <w:kern w:val="0"/>
+      <w14:ligatures w14:val="none"/>
+    </w:rPr>
   </w:style>
-  <w:style w:type="paragraph" w:customStyle="1" w:styleId="DAC0D35971304C878DD511075D23D571">
-    <w:name w:val="DAC0D35971304C878DD511075D23D571"/>
-    <w:rsid w:val="000877A5"/>
+  <w:style w:type="paragraph" w:customStyle="1" w:styleId="9CE26EF61CAB45FBBFFCDC2173C47B111">
+    <w:name w:val="9CE26EF61CAB45FBBFFCDC2173C47B111"/>
+    <w:rsid w:val="00E13A98"/>
+    <w:pPr>
+      <w:spacing w:after="0" w:line="240" w:lineRule="auto"/>
+    </w:pPr>
+    <w:rPr>
+      <w:rFonts w:ascii="Times New Roman" w:eastAsia="Times New Roman" w:hAnsi="Times New Roman" w:cs="Times New Roman"/>
+      <w:kern w:val="0"/>
+      <w14:ligatures w14:val="none"/>
+    </w:rPr>
   </w:style>
-  <w:style w:type="paragraph" w:customStyle="1" w:styleId="9C23D7270A804D1B80099A6E6F865801">
-    <w:name w:val="9C23D7270A804D1B80099A6E6F865801"/>
-    <w:rsid w:val="000877A5"/>
+  <w:style w:type="paragraph" w:customStyle="1" w:styleId="28DD5B7498BC493F8F1AB6C5FA151EBF1">
+    <w:name w:val="28DD5B7498BC493F8F1AB6C5FA151EBF1"/>
+    <w:rsid w:val="00E13A98"/>
+    <w:pPr>
+      <w:spacing w:after="0" w:line="240" w:lineRule="auto"/>
+    </w:pPr>
+    <w:rPr>
+      <w:rFonts w:ascii="Times New Roman" w:eastAsia="Times New Roman" w:hAnsi="Times New Roman" w:cs="Times New Roman"/>
+      <w:kern w:val="0"/>
+      <w14:ligatures w14:val="none"/>
+    </w:rPr>
   </w:style>
-  <w:style w:type="paragraph" w:customStyle="1" w:styleId="771AF8643BC4424492B3CE8C6CE84FFC">
-    <w:name w:val="771AF8643BC4424492B3CE8C6CE84FFC"/>
-    <w:rsid w:val="000877A5"/>
+  <w:style w:type="paragraph" w:customStyle="1" w:styleId="9622CFAE674D4035981766CBD6CECA601">
+    <w:name w:val="9622CFAE674D4035981766CBD6CECA601"/>
+    <w:rsid w:val="00E13A98"/>
+    <w:pPr>
+      <w:spacing w:after="0" w:line="240" w:lineRule="auto"/>
+    </w:pPr>
+    <w:rPr>
+      <w:rFonts w:ascii="Times New Roman" w:eastAsia="Times New Roman" w:hAnsi="Times New Roman" w:cs="Times New Roman"/>
+      <w:kern w:val="0"/>
+      <w14:ligatures w14:val="none"/>
+    </w:rPr>
   </w:style>
-  <w:style w:type="paragraph" w:customStyle="1" w:styleId="037B2E864BC04D6FAF471D02A56BF9BA">
-    <w:name w:val="037B2E864BC04D6FAF471D02A56BF9BA"/>
-    <w:rsid w:val="000877A5"/>
+  <w:style w:type="paragraph" w:customStyle="1" w:styleId="FDD1282F24FC4B829AC0ABA83AB22B191">
+    <w:name w:val="FDD1282F24FC4B829AC0ABA83AB22B191"/>
+    <w:rsid w:val="00E13A98"/>
+    <w:pPr>
+      <w:spacing w:after="0" w:line="240" w:lineRule="auto"/>
+    </w:pPr>
+    <w:rPr>
+      <w:rFonts w:ascii="Times New Roman" w:eastAsia="Times New Roman" w:hAnsi="Times New Roman" w:cs="Times New Roman"/>
+      <w:kern w:val="0"/>
+      <w14:ligatures w14:val="none"/>
+    </w:rPr>
   </w:style>
-  <w:style w:type="paragraph" w:customStyle="1" w:styleId="6C1AE95BE4604657A311845165DD5A7E">
-    <w:name w:val="6C1AE95BE4604657A311845165DD5A7E"/>
-    <w:rsid w:val="000877A5"/>
+  <w:style w:type="paragraph" w:customStyle="1" w:styleId="C99A9A77E8F7443585B2DC69DC3F7AAA1">
+    <w:name w:val="C99A9A77E8F7443585B2DC69DC3F7AAA1"/>
+    <w:rsid w:val="00E13A98"/>
+    <w:pPr>
+      <w:spacing w:after="0" w:line="240" w:lineRule="auto"/>
+    </w:pPr>
+    <w:rPr>
+      <w:rFonts w:ascii="Times New Roman" w:eastAsia="Times New Roman" w:hAnsi="Times New Roman" w:cs="Times New Roman"/>
+      <w:kern w:val="0"/>
+      <w14:ligatures w14:val="none"/>
+    </w:rPr>
   </w:style>
-  <w:style w:type="paragraph" w:customStyle="1" w:styleId="9622CFAE674D4035981766CBD6CECA60">
-    <w:name w:val="9622CFAE674D4035981766CBD6CECA60"/>
-    <w:rsid w:val="002175C6"/>
+  <w:style w:type="paragraph" w:customStyle="1" w:styleId="0CC4DC1991D94863B8F7B911DA2CBF181">
+    <w:name w:val="0CC4DC1991D94863B8F7B911DA2CBF181"/>
+    <w:rsid w:val="00E13A98"/>
+    <w:pPr>
+      <w:spacing w:after="0" w:line="240" w:lineRule="auto"/>
+    </w:pPr>
+    <w:rPr>
+      <w:rFonts w:ascii="Times New Roman" w:eastAsia="Times New Roman" w:hAnsi="Times New Roman" w:cs="Times New Roman"/>
+      <w:kern w:val="0"/>
+      <w14:ligatures w14:val="none"/>
+    </w:rPr>
   </w:style>
-  <w:style w:type="paragraph" w:customStyle="1" w:styleId="0CC4DC1991D94863B8F7B911DA2CBF18">
-    <w:name w:val="0CC4DC1991D94863B8F7B911DA2CBF18"/>
-    <w:rsid w:val="002175C6"/>
+  <w:style w:type="paragraph" w:customStyle="1" w:styleId="87E0A4C4825D4399A8DF77A49BB4C6B81">
+    <w:name w:val="87E0A4C4825D4399A8DF77A49BB4C6B81"/>
+    <w:rsid w:val="00E13A98"/>
+    <w:pPr>
+      <w:spacing w:after="0" w:line="240" w:lineRule="auto"/>
+    </w:pPr>
+    <w:rPr>
+      <w:rFonts w:ascii="Times New Roman" w:eastAsia="Times New Roman" w:hAnsi="Times New Roman" w:cs="Times New Roman"/>
+      <w:kern w:val="0"/>
+      <w14:ligatures w14:val="none"/>
+    </w:rPr>
   </w:style>
-  <w:style w:type="paragraph" w:customStyle="1" w:styleId="D4FC99FBB63D4206AC435DDD9218411F">
-    <w:name w:val="D4FC99FBB63D4206AC435DDD9218411F"/>
-    <w:rsid w:val="002175C6"/>
+  <w:style w:type="paragraph" w:customStyle="1" w:styleId="29358427A07F4C149139741D077299F91">
+    <w:name w:val="29358427A07F4C149139741D077299F91"/>
+    <w:rsid w:val="00E13A98"/>
+    <w:pPr>
+      <w:spacing w:after="0" w:line="240" w:lineRule="auto"/>
+    </w:pPr>
+    <w:rPr>
+      <w:rFonts w:ascii="Times New Roman" w:eastAsia="Times New Roman" w:hAnsi="Times New Roman" w:cs="Times New Roman"/>
+      <w:kern w:val="0"/>
+      <w14:ligatures w14:val="none"/>
+    </w:rPr>
   </w:style>
-  <w:style w:type="paragraph" w:customStyle="1" w:styleId="87E0A4C4825D4399A8DF77A49BB4C6B8">
-    <w:name w:val="87E0A4C4825D4399A8DF77A49BB4C6B8"/>
-    <w:rsid w:val="002175C6"/>
+  <w:style w:type="paragraph" w:customStyle="1" w:styleId="D4FC99FBB63D4206AC435DDD9218411F1">
+    <w:name w:val="D4FC99FBB63D4206AC435DDD9218411F1"/>
+    <w:rsid w:val="00E13A98"/>
+    <w:pPr>
+      <w:spacing w:after="0" w:line="240" w:lineRule="auto"/>
+    </w:pPr>
+    <w:rPr>
+      <w:rFonts w:ascii="Times New Roman" w:eastAsia="Times New Roman" w:hAnsi="Times New Roman" w:cs="Times New Roman"/>
+      <w:kern w:val="0"/>
+      <w14:ligatures w14:val="none"/>
+    </w:rPr>
   </w:style>
-  <w:style w:type="paragraph" w:customStyle="1" w:styleId="29358427A07F4C149139741D077299F9">
-    <w:name w:val="29358427A07F4C149139741D077299F9"/>
-    <w:rsid w:val="002175C6"/>
+  <w:style w:type="paragraph" w:customStyle="1" w:styleId="83AD6591847540EC883D4AB5CE7773EA">
+    <w:name w:val="83AD6591847540EC883D4AB5CE7773EA"/>
+    <w:rsid w:val="00E13A98"/>
+    <w:pPr>
+      <w:spacing w:after="0" w:line="240" w:lineRule="auto"/>
+    </w:pPr>
+    <w:rPr>
+      <w:rFonts w:ascii="Times New Roman" w:eastAsia="Times New Roman" w:hAnsi="Times New Roman" w:cs="Times New Roman"/>
+      <w:kern w:val="0"/>
+      <w14:ligatures w14:val="none"/>
+    </w:rPr>
   </w:style>
-  <w:style w:type="paragraph" w:customStyle="1" w:styleId="FDD1282F24FC4B829AC0ABA83AB22B19">
-    <w:name w:val="FDD1282F24FC4B829AC0ABA83AB22B19"/>
-    <w:rsid w:val="002175C6"/>
+  <w:style w:type="paragraph" w:customStyle="1" w:styleId="4D5F5C4C105A45658A7D021FC10D15CB">
+    <w:name w:val="4D5F5C4C105A45658A7D021FC10D15CB"/>
+    <w:rsid w:val="00E13A98"/>
+    <w:pPr>
+      <w:spacing w:after="0" w:line="240" w:lineRule="auto"/>
+    </w:pPr>
+    <w:rPr>
+      <w:rFonts w:ascii="Times New Roman" w:eastAsia="Times New Roman" w:hAnsi="Times New Roman" w:cs="Times New Roman"/>
+      <w:kern w:val="0"/>
+      <w14:ligatures w14:val="none"/>
+    </w:rPr>
   </w:style>
-  <w:style w:type="paragraph" w:customStyle="1" w:styleId="C99A9A77E8F7443585B2DC69DC3F7AAA">
-    <w:name w:val="C99A9A77E8F7443585B2DC69DC3F7AAA"/>
-    <w:rsid w:val="002175C6"/>
+  <w:style w:type="paragraph" w:customStyle="1" w:styleId="77F12E82CE194D8D8A3A84854B22C223">
+    <w:name w:val="77F12E82CE194D8D8A3A84854B22C223"/>
+    <w:rsid w:val="00E13A98"/>
+    <w:pPr>
+      <w:spacing w:after="0" w:line="240" w:lineRule="auto"/>
+    </w:pPr>
+    <w:rPr>
+      <w:rFonts w:ascii="Times New Roman" w:eastAsia="Times New Roman" w:hAnsi="Times New Roman" w:cs="Times New Roman"/>
+      <w:kern w:val="0"/>
+      <w14:ligatures w14:val="none"/>
+    </w:rPr>
+  </w:style>
+  <w:style w:type="paragraph" w:customStyle="1" w:styleId="24BC14EA41F84EDCAF7BE3CECE1AE261">
+    <w:name w:val="24BC14EA41F84EDCAF7BE3CECE1AE261"/>
+    <w:rsid w:val="00E13A98"/>
+    <w:pPr>
+      <w:spacing w:after="0" w:line="240" w:lineRule="auto"/>
+    </w:pPr>
+    <w:rPr>
+      <w:rFonts w:ascii="Times New Roman" w:eastAsia="Times New Roman" w:hAnsi="Times New Roman" w:cs="Times New Roman"/>
+      <w:kern w:val="0"/>
+      <w14:ligatures w14:val="none"/>
+    </w:rPr>
+  </w:style>
+  <w:style w:type="paragraph" w:customStyle="1" w:styleId="F0FA47C242A8430F9DB02E5DB1CDBE0C1">
+    <w:name w:val="F0FA47C242A8430F9DB02E5DB1CDBE0C1"/>
+    <w:rsid w:val="00E13A98"/>
+    <w:pPr>
+      <w:spacing w:after="0" w:line="240" w:lineRule="auto"/>
+    </w:pPr>
+    <w:rPr>
+      <w:rFonts w:ascii="Times New Roman" w:eastAsia="Times New Roman" w:hAnsi="Times New Roman" w:cs="Times New Roman"/>
+      <w:kern w:val="0"/>
+      <w14:ligatures w14:val="none"/>
+    </w:rPr>
+  </w:style>
+  <w:style w:type="paragraph" w:customStyle="1" w:styleId="D0EF9DEE983D4D66897563C46B51C474">
+    <w:name w:val="D0EF9DEE983D4D66897563C46B51C474"/>
+    <w:rsid w:val="00E13A98"/>
+    <w:pPr>
+      <w:spacing w:after="0" w:line="240" w:lineRule="auto"/>
+    </w:pPr>
+    <w:rPr>
+      <w:rFonts w:ascii="Times New Roman" w:eastAsia="Times New Roman" w:hAnsi="Times New Roman" w:cs="Times New Roman"/>
+      <w:kern w:val="0"/>
+      <w14:ligatures w14:val="none"/>
+    </w:rPr>
+  </w:style>
+  <w:style w:type="paragraph" w:customStyle="1" w:styleId="D63B9B9749BF4CF48F1D4D6156B4DD00">
+    <w:name w:val="D63B9B9749BF4CF48F1D4D6156B4DD00"/>
+    <w:rsid w:val="00E13A98"/>
+    <w:pPr>
+      <w:spacing w:after="0" w:line="240" w:lineRule="auto"/>
+    </w:pPr>
+    <w:rPr>
+      <w:rFonts w:ascii="Times New Roman" w:eastAsia="Times New Roman" w:hAnsi="Times New Roman" w:cs="Times New Roman"/>
+      <w:kern w:val="0"/>
+      <w14:ligatures w14:val="none"/>
+    </w:rPr>
+  </w:style>
+  <w:style w:type="paragraph" w:customStyle="1" w:styleId="DAC0D35971304C878DD511075D23D5711">
+    <w:name w:val="DAC0D35971304C878DD511075D23D5711"/>
+    <w:rsid w:val="00E13A98"/>
+    <w:pPr>
+      <w:spacing w:after="0" w:line="240" w:lineRule="auto"/>
+    </w:pPr>
+    <w:rPr>
+      <w:rFonts w:ascii="Times New Roman" w:eastAsia="Times New Roman" w:hAnsi="Times New Roman" w:cs="Times New Roman"/>
+      <w:kern w:val="0"/>
+      <w14:ligatures w14:val="none"/>
+    </w:rPr>
+  </w:style>
+  <w:style w:type="paragraph" w:customStyle="1" w:styleId="9C23D7270A804D1B80099A6E6F8658011">
+    <w:name w:val="9C23D7270A804D1B80099A6E6F8658011"/>
+    <w:rsid w:val="00E13A98"/>
+    <w:pPr>
+      <w:spacing w:after="0" w:line="240" w:lineRule="auto"/>
+    </w:pPr>
+    <w:rPr>
+      <w:rFonts w:ascii="Times New Roman" w:eastAsia="Times New Roman" w:hAnsi="Times New Roman" w:cs="Times New Roman"/>
+      <w:kern w:val="0"/>
+      <w14:ligatures w14:val="none"/>
+    </w:rPr>
+  </w:style>
+  <w:style w:type="paragraph" w:customStyle="1" w:styleId="771AF8643BC4424492B3CE8C6CE84FFC1">
+    <w:name w:val="771AF8643BC4424492B3CE8C6CE84FFC1"/>
+    <w:rsid w:val="00E13A98"/>
+    <w:pPr>
+      <w:spacing w:after="0" w:line="240" w:lineRule="auto"/>
+    </w:pPr>
+    <w:rPr>
+      <w:rFonts w:ascii="Times New Roman" w:eastAsia="Times New Roman" w:hAnsi="Times New Roman" w:cs="Times New Roman"/>
+      <w:kern w:val="0"/>
+      <w14:ligatures w14:val="none"/>
+    </w:rPr>
+  </w:style>
+  <w:style w:type="paragraph" w:customStyle="1" w:styleId="037B2E864BC04D6FAF471D02A56BF9BA1">
+    <w:name w:val="037B2E864BC04D6FAF471D02A56BF9BA1"/>
+    <w:rsid w:val="00E13A98"/>
+    <w:pPr>
+      <w:spacing w:after="0" w:line="240" w:lineRule="auto"/>
+    </w:pPr>
+    <w:rPr>
+      <w:rFonts w:ascii="Times New Roman" w:eastAsia="Times New Roman" w:hAnsi="Times New Roman" w:cs="Times New Roman"/>
+      <w:kern w:val="0"/>
+      <w14:ligatures w14:val="none"/>
+    </w:rPr>
+  </w:style>
+  <w:style w:type="paragraph" w:customStyle="1" w:styleId="6C1AE95BE4604657A311845165DD5A7E1">
+    <w:name w:val="6C1AE95BE4604657A311845165DD5A7E1"/>
+    <w:rsid w:val="00E13A98"/>
+    <w:pPr>
+      <w:spacing w:after="0" w:line="240" w:lineRule="auto"/>
+    </w:pPr>
+    <w:rPr>
+      <w:rFonts w:ascii="Times New Roman" w:eastAsia="Times New Roman" w:hAnsi="Times New Roman" w:cs="Times New Roman"/>
+      <w:kern w:val="0"/>
+      <w14:ligatures w14:val="none"/>
+    </w:rPr>
   </w:style>
 </w:styles>
 </file>

</xml_diff>